<commit_message>
Update project documentation and progress tracker
- Revised the editable DOCX report to emphasize feature purpose, user interaction, and high-level implementation. Included all 13 operations, tools, parameter ranges/effects, a conclusion, five captioned screenshot spaces, and a demo-link placeholder.
- Updated progress tracker to reflect the latest changes, including the revision date to 2026-09-22.
- Added optional Windows/macOS packaging and beginner build/install instructions; verified macOS app functionality.
</commit_message>
<xml_diff>
--- a/Computer_Vision_Project_Report.docx
+++ b/Computer_Vision_Project_Report.docx
@@ -14,58 +14,261 @@
     </w:p>
     <w:p>
       <w:r>
-        <w:t>Editable project report • Python / OpenCV / Tkinter</w:t>
-      </w:r>
-    </w:p>
-    <w:p>
-      <w:r>
         <w:t>Student: [Name]    Student ID: [ID]</w:t>
         <w:br/>
         <w:t>Course: [Course]    Instructor: [Name]    Submission date: [Date]</w:t>
       </w:r>
     </w:p>
     <w:p>
+      <w:r>
+        <w:t>Demo video link (2–4 minutes): [Insert accessible Google Drive link here]</w:t>
+      </w:r>
+    </w:p>
+    <w:p>
       <w:pPr>
-        <w:pStyle w:val="Heading2"/>
+        <w:pStyle w:val="Heading1"/>
       </w:pPr>
       <w:r>
-        <w:t>Project overview</w:t>
+        <w:t>1. Project overview</w:t>
       </w:r>
     </w:p>
     <w:p>
       <w:r>
-        <w:t>This standalone desktop application loads local images or captures a webcam snapshot, applies computer-vision operations, and saves the result. The interface combines a File/Tools menu, operation selector, live sliders, validated textboxes, Apply/Reset controls, and an image preview. The design prioritizes correctness, understandable code, and safe handling of invalid input.</w:t>
+        <w:t>This project is a standalone desktop application for exploring image processing through a graphical interface. Users can open a local image or capture a webcam snapshot, select an operation, adjust its settings, view the result, and save it. The application brings common computer-vision techniques into one accessible workspace for learning and demonstration.</w:t>
+      </w:r>
+    </w:p>
+    <w:p>
+      <w:r>
+        <w:t>Thirteen operations cover the five assignment categories: foundations and color, image statistics, point and local operators, edge detection, and segmentation. The interface emphasizes clear controls, immediate visual feedback where appropriate, and safe recovery from invalid input.</w:t>
       </w:r>
     </w:p>
     <w:p>
       <w:pPr>
-        <w:pStyle w:val="Heading2"/>
+        <w:pStyle w:val="Heading1"/>
       </w:pPr>
       <w:r>
-        <w:t>Implemented functionality</w:t>
-      </w:r>
-    </w:p>
-    <w:p>
-      <w:r>
-        <w:t>Thirteen operations cover all five assignment categories: three color operations, both required statistics operations, three local filters, two edge detectors, and three segmentation operations. JPG/JPEG, PNG, and BMP input/output are supported. Webcam capture includes live preview, snapshot, stop, and resource cleanup.</w:t>
-      </w:r>
-    </w:p>
-    <w:p>
-      <w:pPr>
-        <w:pStyle w:val="Heading2"/>
-      </w:pPr>
-      <w:r>
-        <w:t>Typical workflow</w:t>
-      </w:r>
-    </w:p>
-    <w:p>
-      <w:r>
-        <w:t>Open an image or take a snapshot → choose an operation → adjust parameters → inspect the result → Save As. Each operation uses the original image; operations do not form a cumulative processing chain. Reset restores the original and default parameters while retaining the selected operation.</w:t>
+        <w:t>Tools used</w:t>
       </w:r>
     </w:p>
     <w:tbl>
       <w:tblPr>
         <w:tblStyle w:val="TableGrid"/>
+        <w:tblW w:type="auto" w:w="0"/>
+        <w:tblLayout w:type="fixed"/>
+        <w:tblLook w:firstColumn="1" w:firstRow="1" w:lastColumn="0" w:lastRow="0" w:noHBand="0" w:noVBand="1" w:val="04A0"/>
+      </w:tblPr>
+      <w:tblGrid>
+        <w:gridCol w:w="1656"/>
+        <w:gridCol w:w="8136"/>
+      </w:tblGrid>
+      <w:tr>
+        <w:trPr>
+          <w:tblHeader/>
+          <w:cantSplit/>
+        </w:trPr>
+        <w:tc>
+          <w:tcPr>
+            <w:tcW w:type="dxa" w:w="1656"/>
+            <w:shd w:fill="234E70"/>
+          </w:tcPr>
+          <w:p>
+            <w:pPr>
+              <w:spacing w:after="60" w:before="60"/>
+            </w:pPr>
+            <w:r>
+              <w:rPr>
+                <w:b/>
+                <w:color w:val="FFFFFF"/>
+                <w:sz w:val="18"/>
+              </w:rPr>
+              <w:t>Tool</w:t>
+            </w:r>
+          </w:p>
+        </w:tc>
+        <w:tc>
+          <w:tcPr>
+            <w:tcW w:type="dxa" w:w="8136"/>
+            <w:shd w:fill="234E70"/>
+          </w:tcPr>
+          <w:p>
+            <w:pPr>
+              <w:spacing w:after="60" w:before="60"/>
+            </w:pPr>
+            <w:r>
+              <w:rPr>
+                <w:b/>
+                <w:color w:val="FFFFFF"/>
+                <w:sz w:val="18"/>
+              </w:rPr>
+              <w:t>Role in the application</w:t>
+            </w:r>
+          </w:p>
+        </w:tc>
+      </w:tr>
+      <w:tr>
+        <w:trPr>
+          <w:cantSplit/>
+        </w:trPr>
+        <w:tc>
+          <w:tcPr>
+            <w:tcW w:type="dxa" w:w="1656"/>
+          </w:tcPr>
+          <w:p>
+            <w:pPr>
+              <w:spacing w:after="60" w:before="60"/>
+            </w:pPr>
+            <w:r>
+              <w:rPr>
+                <w:sz w:val="18"/>
+              </w:rPr>
+              <w:t>Python</w:t>
+            </w:r>
+          </w:p>
+        </w:tc>
+        <w:tc>
+          <w:tcPr>
+            <w:tcW w:type="dxa" w:w="8136"/>
+          </w:tcPr>
+          <w:p>
+            <w:pPr>
+              <w:spacing w:after="60" w:before="60"/>
+            </w:pPr>
+            <w:r>
+              <w:rPr>
+                <w:sz w:val="18"/>
+              </w:rPr>
+              <w:t>Main programming language and application coordination.</w:t>
+            </w:r>
+          </w:p>
+        </w:tc>
+      </w:tr>
+      <w:tr>
+        <w:trPr>
+          <w:cantSplit/>
+        </w:trPr>
+        <w:tc>
+          <w:tcPr>
+            <w:tcW w:type="dxa" w:w="1656"/>
+          </w:tcPr>
+          <w:p>
+            <w:pPr>
+              <w:spacing w:after="60" w:before="60"/>
+            </w:pPr>
+            <w:r>
+              <w:rPr>
+                <w:sz w:val="18"/>
+              </w:rPr>
+              <w:t>Tkinter</w:t>
+            </w:r>
+          </w:p>
+        </w:tc>
+        <w:tc>
+          <w:tcPr>
+            <w:tcW w:type="dxa" w:w="8136"/>
+          </w:tcPr>
+          <w:p>
+            <w:pPr>
+              <w:spacing w:after="60" w:before="60"/>
+            </w:pPr>
+            <w:r>
+              <w:rPr>
+                <w:sz w:val="18"/>
+              </w:rPr>
+              <w:t>Desktop window, menus, buttons, sliders, input fields, dialogs, and histogram display.</w:t>
+            </w:r>
+          </w:p>
+        </w:tc>
+      </w:tr>
+      <w:tr>
+        <w:trPr>
+          <w:cantSplit/>
+        </w:trPr>
+        <w:tc>
+          <w:tcPr>
+            <w:tcW w:type="dxa" w:w="1656"/>
+          </w:tcPr>
+          <w:p>
+            <w:pPr>
+              <w:spacing w:after="60" w:before="60"/>
+            </w:pPr>
+            <w:r>
+              <w:rPr>
+                <w:sz w:val="18"/>
+              </w:rPr>
+              <w:t>OpenCV</w:t>
+            </w:r>
+          </w:p>
+        </w:tc>
+        <w:tc>
+          <w:tcPr>
+            <w:tcW w:type="dxa" w:w="8136"/>
+          </w:tcPr>
+          <w:p>
+            <w:pPr>
+              <w:spacing w:after="60" w:before="60"/>
+            </w:pPr>
+            <w:r>
+              <w:rPr>
+                <w:sz w:val="18"/>
+              </w:rPr>
+              <w:t>Image loading/saving, processing operations, and webcam capture.</w:t>
+            </w:r>
+          </w:p>
+        </w:tc>
+      </w:tr>
+      <w:tr>
+        <w:trPr>
+          <w:cantSplit/>
+        </w:trPr>
+        <w:tc>
+          <w:tcPr>
+            <w:tcW w:type="dxa" w:w="1656"/>
+          </w:tcPr>
+          <w:p>
+            <w:pPr>
+              <w:spacing w:after="60" w:before="60"/>
+            </w:pPr>
+            <w:r>
+              <w:rPr>
+                <w:sz w:val="18"/>
+              </w:rPr>
+              <w:t>NumPy</w:t>
+            </w:r>
+          </w:p>
+        </w:tc>
+        <w:tc>
+          <w:tcPr>
+            <w:tcW w:type="dxa" w:w="8136"/>
+          </w:tcPr>
+          <w:p>
+            <w:pPr>
+              <w:spacing w:after="60" w:before="60"/>
+            </w:pPr>
+            <w:r>
+              <w:rPr>
+                <w:sz w:val="18"/>
+              </w:rPr>
+              <w:t>Numerical image calculations, including brightness and color adjustments.</w:t>
+            </w:r>
+          </w:p>
+        </w:tc>
+      </w:tr>
+    </w:tbl>
+    <w:p>
+      <w:pPr>
+        <w:pStyle w:val="Heading1"/>
+      </w:pPr>
+      <w:r>
+        <w:t>Basic user workflow</w:t>
+      </w:r>
+    </w:p>
+    <w:p>
+      <w:r>
+        <w:t>Open an image or capture a snapshot → choose an operation → adjust settings → inspect the preview → save the result. The program runs locally using Python with Tkinter and the dependencies listed in the project requirements.</w:t>
+      </w:r>
+    </w:p>
+    <w:tbl>
+      <w:tblPr>
         <w:tblW w:type="auto" w:w="0"/>
         <w:jc w:val="center"/>
         <w:tblLook w:firstColumn="1" w:firstRow="1" w:lastColumn="0" w:lastRow="0" w:noHBand="0" w:noVBand="1" w:val="04A0"/>
@@ -75,12 +278,13 @@
       </w:tblGrid>
       <w:tr>
         <w:trPr>
-          <w:trHeight w:val="3312" w:hRule="exact"/>
+          <w:trHeight w:val="2376"/>
         </w:trPr>
         <w:tc>
           <w:tcPr>
             <w:tcW w:type="dxa" w:w="9893"/>
             <w:vAlign w:val="center"/>
+            <w:shd w:fill="F1F5F9"/>
           </w:tcPr>
           <w:p>
             <w:pPr>
@@ -90,7 +294,7 @@
               <w:rPr>
                 <w:i/>
               </w:rPr>
-              <w:t>[ Insert screenshot here ]</w:t>
+              <w:t>SS PLACE — INSERT SCREENSHOT HERE</w:t>
             </w:r>
           </w:p>
         </w:tc>
@@ -99,15 +303,9 @@
     <w:p>
       <w:pPr>
         <w:pStyle w:val="Caption"/>
-        <w:spacing w:after="140"/>
       </w:pPr>
       <w:r>
-        <w:t>Figure 1. Main interface with a loaded image, operation controls, applied-result label, and Save As button.</w:t>
-      </w:r>
-    </w:p>
-    <w:p>
-      <w:r>
-        <w:t>Report preparation: replace the student details and screenshot placeholders, then export to PDF. Video production is outside this report task. The assignment separately requests a 2–4 minute demo and its link on the first PDF page; that deliverable has not been supplied.</w:t>
+        <w:t>Figure 1. Main application with a loaded image, operation controls, preview, and applied-result label.</w:t>
       </w:r>
     </w:p>
     <w:p>
@@ -120,7 +318,7 @@
         <w:pStyle w:val="Heading1"/>
       </w:pPr>
       <w:r>
-        <w:t>1. Foundations, Color and Statistics</w:t>
+        <w:t>2. Using the application</w:t>
       </w:r>
     </w:p>
     <w:p>
@@ -128,12 +326,12 @@
         <w:pStyle w:val="Heading2"/>
       </w:pPr>
       <w:r>
-        <w:t>1.1 Grayscale conversion</w:t>
+        <w:t>Open, preview, and save images</w:t>
       </w:r>
     </w:p>
     <w:p>
       <w:r>
-        <w:t>Converts BGR color pixels to grayscale using OpenCV’s weighted color conversion. The output is a single-channel intensity image. No parameters are required; for example, pure red converts to approximately 76 on the 0–255 scale.</w:t>
+        <w:t>Choose File → Open… to load a JPG/JPEG, PNG, or BMP image. The preview fits the available space while preserving the image’s proportions. Choose File → Save As… or the Save As button to save the displayed result. The application keeps the full-resolution image separately from the preview, so resizing the window does not reduce saved image dimensions.</w:t>
       </w:r>
     </w:p>
     <w:p>
@@ -141,12 +339,12 @@
         <w:pStyle w:val="Heading2"/>
       </w:pPr>
       <w:r>
-        <w:t>1.2 Brightness / Contrast</w:t>
+        <w:t>Choose operations and adjust settings</w:t>
       </w:r>
     </w:p>
     <w:p>
       <w:r>
-        <w:t>Computes contrast × pixel + brightness in floating point, rounds the result, and clips it to 0–255. Brightness offsets intensity; contrast scales it. Both sliders update live. Repeated Apply does not compound the adjustment because the loaded original is always used.</w:t>
+        <w:t>Select an operation from the operation selector or Tools menu. Its default settings are applied when an image is available. Brightness, contrast, RGB, and threshold sliders update the result interactively. For text fields and parameter dropdowns, edit the values and click Apply. The label above the preview identifies the operation and settings that produced the displayed result.</w:t>
       </w:r>
     </w:p>
     <w:p>
@@ -154,12 +352,12 @@
         <w:pStyle w:val="Heading2"/>
       </w:pPr>
       <w:r>
-        <w:t>1.3 RGB channel manipulation</w:t>
+        <w:t>Reset and compare results</w:t>
       </w:r>
     </w:p>
     <w:p>
       <w:r>
-        <w:t>Multiplies red, green, and blue independently by user-selected gains. OpenCV stores the array in BGR order, so gains are mapped accordingly. A gain of zero removes a channel; one preserves it; two doubles it with clipping. Sliders update live.</w:t>
+        <w:t>Each image-processing operation starts from the loaded image or captured snapshot. Repeated adjustments therefore do not accumulate, and switching operations does not combine effects. Reset restores the original image and default settings while keeping the selected operation. Histogram viewing is different: it measures the currently displayed result without replacing it.</w:t>
       </w:r>
     </w:p>
     <w:p>
@@ -167,30 +365,21 @@
         <w:pStyle w:val="Heading2"/>
       </w:pPr>
       <w:r>
-        <w:t>1.4 Histogram computation and display</w:t>
+        <w:t>Access the webcam and take a snapshot</w:t>
       </w:r>
     </w:p>
     <w:p>
       <w:r>
-        <w:t>Computes 256 grayscale intensity counts for the currently displayed image. A reusable Tkinter window draws the histogram and refreshes when the result changes. The horizontal axis is intensity and the vertical axis is pixel count. Opening Histogram does not replace the image; Save As saves the image rather than the graph.</w:t>
-      </w:r>
-    </w:p>
-    <w:p>
-      <w:pPr>
-        <w:pStyle w:val="Heading2"/>
-      </w:pPr>
-      <w:r>
-        <w:t>1.5 Histogram equalization</w:t>
+        <w:t>Choose File → Access Live Webcam to view the camera feed. Take Snapshot captures the latest frame, stops the camera, and makes the captured image available for all processing and saving features. Stop Webcam returns to the previous static image and result. Snapshot and Stop controls appear during live capture; take a snapshot or stop the feed before processing or saving.</w:t>
       </w:r>
     </w:p>
     <w:p>
       <w:r>
-        <w:t>Converts the original to grayscale, then uses cv2.equalizeHist to redistribute intensity levels according to their cumulative distribution. This can improve contrast in a low-contrast image. A uniform image may remain unchanged. No parameters are required.</w:t>
+        <w:t>At a high level, the application repeatedly reads camera frames and updates the preview. It releases the camera after a snapshot, on Stop, on a camera failure, and when the application closes.</w:t>
       </w:r>
     </w:p>
     <w:tbl>
       <w:tblPr>
-        <w:tblStyle w:val="TableGrid"/>
         <w:tblW w:type="auto" w:w="0"/>
         <w:jc w:val="center"/>
         <w:tblLook w:firstColumn="1" w:firstRow="1" w:lastColumn="0" w:lastRow="0" w:noHBand="0" w:noVBand="1" w:val="04A0"/>
@@ -200,12 +389,13 @@
       </w:tblGrid>
       <w:tr>
         <w:trPr>
-          <w:trHeight w:val="3024" w:hRule="exact"/>
+          <w:trHeight w:val="2808"/>
         </w:trPr>
         <w:tc>
           <w:tcPr>
             <w:tcW w:type="dxa" w:w="9893"/>
             <w:vAlign w:val="center"/>
+            <w:shd w:fill="F1F5F9"/>
           </w:tcPr>
           <w:p>
             <w:pPr>
@@ -215,7 +405,7 @@
               <w:rPr>
                 <w:i/>
               </w:rPr>
-              <w:t>[ Insert screenshot here ]</w:t>
+              <w:t>SS PLACE — INSERT SCREENSHOT HERE</w:t>
             </w:r>
           </w:p>
         </w:tc>
@@ -224,10 +414,9 @@
     <w:p>
       <w:pPr>
         <w:pStyle w:val="Caption"/>
-        <w:spacing w:after="140"/>
       </w:pPr>
       <w:r>
-        <w:t>Figure 2. Histogram window and the corresponding grayscale or equalized image; show the intensity distribution.</w:t>
+        <w:t>Figure 2. Live webcam preview with Take Snapshot and Stop Webcam controls visible.</w:t>
       </w:r>
     </w:p>
     <w:p>
@@ -240,7 +429,7 @@
         <w:pStyle w:val="Heading1"/>
       </w:pPr>
       <w:r>
-        <w:t>2. Local Filters and Edge Detection</w:t>
+        <w:t>3. Foundations, color, and statistics</w:t>
       </w:r>
     </w:p>
     <w:p>
@@ -248,12 +437,12 @@
         <w:pStyle w:val="Heading2"/>
       </w:pPr>
       <w:r>
-        <w:t>2.1 Median Filter</w:t>
+        <w:t>Grayscale</w:t>
       </w:r>
     </w:p>
     <w:p>
       <w:r>
-        <w:t>Replaces each pixel with its neighborhood median, independently by channel. It is useful for isolated speckle noise. Enter an odd kernel size and press Apply. Larger kernels act over larger neighborhoods and can remove fine detail.</w:t>
+        <w:t>Select Grayscale to remove color and display brightness differences. The application combines the color information into a grayscale image, making shapes and light–dark patterns easier to examine. No settings are required.</w:t>
       </w:r>
     </w:p>
     <w:p>
@@ -261,12 +450,12 @@
         <w:pStyle w:val="Heading2"/>
       </w:pPr>
       <w:r>
-        <w:t>2.2 Gaussian Smoothing</w:t>
+        <w:t>Brightness / Contrast</w:t>
       </w:r>
     </w:p>
     <w:p>
       <w:r>
-        <w:t>Applies a Gaussian-weighted local average. Kernel size sets the neighborhood and sigma controls the weight spread. Sigma zero asks OpenCV to derive it automatically. Edit the kernel/sigma textboxes, then Apply.</w:t>
+        <w:t>Move the brightness slider to lighten or darken the image and the contrast slider to adjust intensity differences. The application shifts brightness and scales pixel intensities, keeping the result within the valid image range. Extreme adjustments can hide detail in very dark or bright regions.</w:t>
       </w:r>
     </w:p>
     <w:p>
@@ -274,12 +463,12 @@
         <w:pStyle w:val="Heading2"/>
       </w:pPr>
       <w:r>
-        <w:t>2.3 Sharpening</w:t>
+        <w:t>RGB Channels</w:t>
       </w:r>
     </w:p>
     <w:p>
       <w:r>
-        <w:t>Uses the fixed 3×3 kernel [0, −1, 0; −1, 5, −1; 0, −1, 0]. Subtracting neighboring intensities emphasizes local differences. Output is clipped to the input’s 8-bit range. Sharpening can also amplify noise; there is no adjustable parameter.</w:t>
+        <w:t>Adjust the Red, Green, and Blue sliders independently to change the color balance. Each control scales its corresponding color contribution: 1 keeps it unchanged, 0 removes it, and values above 1 strengthen it. The preview updates as the sliders move.</w:t>
       </w:r>
     </w:p>
     <w:p>
@@ -287,12 +476,12 @@
         <w:pStyle w:val="Heading2"/>
       </w:pPr>
       <w:r>
-        <w:t>2.4 Sobel Edge Detection</w:t>
+        <w:t>Histogram computation and display</w:t>
       </w:r>
     </w:p>
     <w:p>
       <w:r>
-        <w:t>Computes signed horizontal and vertical derivatives in 64-bit floating point. Magnitude = √(Gx² + Gy²). A pixel becomes white only when its magnitude is greater than mean ratio × mean magnitude; other pixels become black. The mean is taken over gradient magnitudes, not original intensities. A larger ratio retains fewer edges. Strict comparison keeps constant images black.</w:t>
+        <w:t>Select Histogram to open a graph of the displayed image’s brightness distribution. The horizontal axis shows intensity from dark to bright; the vertical axis shows pixel counts. The application counts grayscale brightness levels and refreshes the graph when the displayed result changes. Viewing the histogram does not alter the image; Save As saves the image, not the graph.</w:t>
       </w:r>
     </w:p>
     <w:p>
@@ -300,17 +489,16 @@
         <w:pStyle w:val="Heading2"/>
       </w:pPr>
       <w:r>
-        <w:t>2.5 Canny Edge Detection</w:t>
+        <w:t>Histogram Equalization</w:t>
       </w:r>
     </w:p>
     <w:p>
       <w:r>
-        <w:t>Converts the original to grayscale and applies Canny with lower/upper thresholds and the chosen aperture. Strong candidates and connected weak candidates form thinned edges. The implementation uses OpenCV’s default L1 gradient measure and adds no preliminary blur. Threshold 1 must not exceed threshold 2.</w:t>
+        <w:t>Select Histogram Equalization to redistribute grayscale brightness levels and improve contrast where intensities are concentrated in a narrow range. The application converts the original to grayscale and redistributes its intensity levels. The output is grayscale, requires no settings, and may show little change for some images.</w:t>
       </w:r>
     </w:p>
     <w:tbl>
       <w:tblPr>
-        <w:tblStyle w:val="TableGrid"/>
         <w:tblW w:type="auto" w:w="0"/>
         <w:jc w:val="center"/>
         <w:tblLook w:firstColumn="1" w:firstRow="1" w:lastColumn="0" w:lastRow="0" w:noHBand="0" w:noVBand="1" w:val="04A0"/>
@@ -320,12 +508,13 @@
       </w:tblGrid>
       <w:tr>
         <w:trPr>
-          <w:trHeight w:val="2736" w:hRule="exact"/>
+          <w:trHeight w:val="2664"/>
         </w:trPr>
         <w:tc>
           <w:tcPr>
             <w:tcW w:type="dxa" w:w="9893"/>
             <w:vAlign w:val="center"/>
+            <w:shd w:fill="F1F5F9"/>
           </w:tcPr>
           <w:p>
             <w:pPr>
@@ -335,7 +524,7 @@
               <w:rPr>
                 <w:i/>
               </w:rPr>
-              <w:t>[ Insert screenshot here ]</w:t>
+              <w:t>SS PLACE — INSERT SCREENSHOT HERE</w:t>
             </w:r>
           </w:p>
         </w:tc>
@@ -344,10 +533,9 @@
     <w:p>
       <w:pPr>
         <w:pStyle w:val="Caption"/>
-        <w:spacing w:after="140"/>
       </w:pPr>
       <w:r>
-        <w:t>Figure 3. Sobel or Canny edge result with its applied parameter values visible above the preview.</w:t>
+        <w:t>Figure 3. Histogram window alongside the corresponding equalized or grayscale image.</w:t>
       </w:r>
     </w:p>
     <w:p>
@@ -360,7 +548,7 @@
         <w:pStyle w:val="Heading1"/>
       </w:pPr>
       <w:r>
-        <w:t>3. Segmentation</w:t>
+        <w:t>4. Local filters and edge detection</w:t>
       </w:r>
     </w:p>
     <w:p>
@@ -368,12 +556,12 @@
         <w:pStyle w:val="Heading2"/>
       </w:pPr>
       <w:r>
-        <w:t>3.1 Global Thresholding</w:t>
+        <w:t>Median Filter</w:t>
       </w:r>
     </w:p>
     <w:p>
       <w:r>
-        <w:t>Converts to grayscale and creates a binary mask: intensity &gt; threshold becomes 255 (white); all other pixels become zero. For threshold 127, [126, 127, 128] becomes [0, 0, 255]. The slider updates live. At threshold 255 the mask is entirely black.</w:t>
+        <w:t>Enter an odd kernel size and click Apply to reduce isolated speckle noise. The application replaces each pixel using the middle value in its surrounding neighborhood. Larger neighborhoods remove more small detail as well as noise.</w:t>
       </w:r>
     </w:p>
     <w:p>
@@ -381,17 +569,12 @@
         <w:pStyle w:val="Heading2"/>
       </w:pPr>
       <w:r>
-        <w:t>3.2 Adaptive Thresholding</w:t>
+        <w:t>Gaussian Smoothing</w:t>
       </w:r>
     </w:p>
     <w:p>
       <w:r>
-        <w:t>Uses a local threshold for each pixel, which can help with uneven illumination. Mean uses an arithmetic neighborhood average; Gaussian uses a weighted average. The threshold is the local value minus constant C. Increasing C generally makes more pixels white. OpenCV applies integer-pixel rounding, so small fractional changes can give the same mask.</w:t>
-      </w:r>
-    </w:p>
-    <w:p>
-      <w:r>
-        <w:t>Block size must be odd and greater than one. Border pixels are replicated to extend neighborhoods, allowing blocks larger than the image. Block size, C, and method edits are processed on Apply. The output remains a full-resolution grayscale binary mask.</w:t>
+        <w:t>Set the kernel size and sigma, then click Apply to soften fine detail and reduce noise. The application blends neighboring pixels with greater influence from nearby pixels. Kernel size determines the neighborhood; sigma controls the spread of the smoothing. A sigma of 0 selects an automatic value.</w:t>
       </w:r>
     </w:p>
     <w:p>
@@ -399,22 +582,42 @@
         <w:pStyle w:val="Heading2"/>
       </w:pPr>
       <w:r>
-        <w:t>3.3 Contour Detection</w:t>
+        <w:t>Sharpening</w:t>
       </w:r>
     </w:p>
     <w:p>
       <w:r>
-        <w:t>Creates a global-threshold mask internally, retrieves only external contours with RETR_EXTERNAL, and simplifies straight boundary runs using CHAIN_APPROX_SIMPLE. All detected outer contours are drawn in green, two pixels thick, over a copy of the original. Grayscale originals are converted to BGR for the overlay.</w:t>
+        <w:t>Select Sharpening to emphasize local detail and boundaries. The application uses a fixed sharpening filter that increases differences between a pixel and its neighbors. No settings are needed. Sharpening can also make existing noise more noticeable.</w:t>
+      </w:r>
+    </w:p>
+    <w:p>
+      <w:pPr>
+        <w:pStyle w:val="Heading2"/>
+      </w:pPr>
+      <w:r>
+        <w:t>Sobel Edge Detection</w:t>
       </w:r>
     </w:p>
     <w:p>
       <w:r>
-        <w:t>Bright regions are foreground. Holes are not outlined and no area filter is applied. A dark object against a bright background may select the surrounding bright region instead. With no foreground, the result retains the original appearance. The threshold slider updates live.</w:t>
+        <w:t>Choose a kernel size, enter a mean ratio, and click Apply. The application measures horizontal and vertical intensity changes, combines their strengths, and displays edges in white on black. It selects edges using a threshold based on the average edge strength multiplied by the mean ratio. Increasing the ratio generally retains fewer, stronger edges.</w:t>
+      </w:r>
+    </w:p>
+    <w:p>
+      <w:pPr>
+        <w:pStyle w:val="Heading2"/>
+      </w:pPr>
+      <w:r>
+        <w:t>Canny Edge Detection</w:t>
+      </w:r>
+    </w:p>
+    <w:p>
+      <w:r>
+        <w:t>Enter the lower and upper thresholds, select an aperture size, and click Apply. The application detects intensity changes, narrows edge responses, and retains strong edges together with weaker edges connected to them. Higher thresholds generally reduce weak edge detail. The lower threshold must not exceed the upper threshold.</w:t>
       </w:r>
     </w:p>
     <w:tbl>
       <w:tblPr>
-        <w:tblStyle w:val="TableGrid"/>
         <w:tblW w:type="auto" w:w="0"/>
         <w:jc w:val="center"/>
         <w:tblLook w:firstColumn="1" w:firstRow="1" w:lastColumn="0" w:lastRow="0" w:noHBand="0" w:noVBand="1" w:val="04A0"/>
@@ -424,12 +627,13 @@
       </w:tblGrid>
       <w:tr>
         <w:trPr>
-          <w:trHeight w:val="3600" w:hRule="exact"/>
+          <w:trHeight w:val="2808"/>
         </w:trPr>
         <w:tc>
           <w:tcPr>
             <w:tcW w:type="dxa" w:w="9893"/>
             <w:vAlign w:val="center"/>
+            <w:shd w:fill="F1F5F9"/>
           </w:tcPr>
           <w:p>
             <w:pPr>
@@ -439,7 +643,7 @@
               <w:rPr>
                 <w:i/>
               </w:rPr>
-              <w:t>[ Insert screenshot here ]</w:t>
+              <w:t>SS PLACE — INSERT SCREENSHOT HERE</w:t>
             </w:r>
           </w:p>
         </w:tc>
@@ -448,10 +652,9 @@
     <w:p>
       <w:pPr>
         <w:pStyle w:val="Caption"/>
-        <w:spacing w:after="140"/>
       </w:pPr>
       <w:r>
-        <w:t>Figure 4. Contour overlay or adaptive-threshold mask, with the selected operation and relevant controls visible.</w:t>
+        <w:t>Figure 4. Sobel or Canny result with the selected operation and applied settings visible.</w:t>
       </w:r>
     </w:p>
     <w:p>
@@ -464,1168 +667,76 @@
         <w:pStyle w:val="Heading1"/>
       </w:pPr>
       <w:r>
-        <w:t>4. Parameter Reference</w:t>
+        <w:t>5. Segmentation and safe interaction</w:t>
+      </w:r>
+    </w:p>
+    <w:p>
+      <w:pPr>
+        <w:pStyle w:val="Heading2"/>
+      </w:pPr>
+      <w:r>
+        <w:t>Global Thresholding</w:t>
       </w:r>
     </w:p>
     <w:p>
       <w:r>
-        <w:t>Selecting an operation applies defaults. Sliders update live; textboxes and parameter dropdowns wait for Apply. Invalid parameters retain the last successful result and label.</w:t>
+        <w:t>Move the threshold slider to separate bright regions from darker areas. The application converts the image to grayscale and compares every pixel with one threshold: pixels brighter than the threshold become white, while the rest become black. Raising the threshold reduces the white foreground.</w:t>
+      </w:r>
+    </w:p>
+    <w:p>
+      <w:pPr>
+        <w:pStyle w:val="Heading2"/>
+      </w:pPr>
+      <w:r>
+        <w:t>Adaptive Thresholding</w:t>
+      </w:r>
+    </w:p>
+    <w:p>
+      <w:r>
+        <w:t>Choose a Mean or Gaussian method, set the block size and constant C, and click Apply. The application calculates a local threshold for each neighborhood, which can help with uneven illumination. Block size controls the area considered; C adjusts the local threshold. Increasing C generally makes more pixels white. Gaussian gives nearby pixels more influence than the Mean method.</w:t>
+      </w:r>
+    </w:p>
+    <w:p>
+      <w:pPr>
+        <w:pStyle w:val="Heading2"/>
+      </w:pPr>
+      <w:r>
+        <w:t>Contour Detection</w:t>
+      </w:r>
+    </w:p>
+    <w:p>
+      <w:r>
+        <w:t>Move the threshold slider to control which bright regions are selected. The application first separates the foreground using global thresholding, then finds its outer boundaries and draws them in green over the original image. Internal holes are not outlined. Results depend on the chosen threshold and image lighting; the feature outlines regions rather than recognizing object identities.</w:t>
       </w:r>
     </w:p>
     <w:tbl>
       <w:tblPr>
-        <w:tblStyle w:val="LightShading-Accent1"/>
         <w:tblW w:type="auto" w:w="0"/>
+        <w:jc w:val="center"/>
         <w:tblLook w:firstColumn="1" w:firstRow="1" w:lastColumn="0" w:lastRow="0" w:noHBand="0" w:noVBand="1" w:val="04A0"/>
       </w:tblPr>
       <w:tblGrid>
-        <w:gridCol w:w="2473"/>
-        <w:gridCol w:w="2473"/>
-        <w:gridCol w:w="2473"/>
-        <w:gridCol w:w="2473"/>
+        <w:gridCol w:w="9893"/>
       </w:tblGrid>
       <w:tr>
-        <w:tc>
-          <w:tcPr>
-            <w:tcW w:type="dxa" w:w="2473"/>
-          </w:tcPr>
-          <w:p>
-            <w:r>
-              <w:t>Operation</w:t>
-            </w:r>
-          </w:p>
-        </w:tc>
-        <w:tc>
-          <w:tcPr>
-            <w:tcW w:type="dxa" w:w="2473"/>
-          </w:tcPr>
-          <w:p>
-            <w:r>
-              <w:t>Parameter / control</w:t>
-            </w:r>
-          </w:p>
-        </w:tc>
-        <w:tc>
-          <w:tcPr>
-            <w:tcW w:type="dxa" w:w="2473"/>
-          </w:tcPr>
-          <w:p>
-            <w:r>
-              <w:t>Range; default</w:t>
-            </w:r>
-          </w:p>
-        </w:tc>
-        <w:tc>
-          <w:tcPr>
-            <w:tcW w:type="dxa" w:w="2473"/>
-          </w:tcPr>
-          <w:p>
-            <w:r>
-              <w:t>Effect</w:t>
-            </w:r>
-          </w:p>
-        </w:tc>
-      </w:tr>
-      <w:tr>
         <w:trPr>
-          <w:cantSplit/>
+          <w:trHeight w:val="2448"/>
         </w:trPr>
         <w:tc>
           <w:tcPr>
-            <w:tcW w:type="dxa" w:w="2473"/>
+            <w:tcW w:type="dxa" w:w="9893"/>
+            <w:vAlign w:val="center"/>
+            <w:shd w:fill="F1F5F9"/>
           </w:tcPr>
           <w:p>
             <w:pPr>
-              <w:spacing w:after="80"/>
+              <w:jc w:val="center"/>
             </w:pPr>
             <w:r>
               <w:rPr>
-                <w:sz w:val="18"/>
+                <w:i/>
               </w:rPr>
-              <w:t>Brightness / Contrast</w:t>
-            </w:r>
-          </w:p>
-        </w:tc>
-        <w:tc>
-          <w:tcPr>
-            <w:tcW w:type="dxa" w:w="2473"/>
-          </w:tcPr>
-          <w:p>
-            <w:pPr>
-              <w:spacing w:after="80"/>
-            </w:pPr>
-            <w:r>
-              <w:rPr>
-                <w:sz w:val="18"/>
-              </w:rPr>
-              <w:t>Brightness • slider</w:t>
-            </w:r>
-          </w:p>
-        </w:tc>
-        <w:tc>
-          <w:tcPr>
-            <w:tcW w:type="dxa" w:w="2473"/>
-          </w:tcPr>
-          <w:p>
-            <w:pPr>
-              <w:spacing w:after="80"/>
-            </w:pPr>
-            <w:r>
-              <w:rPr>
-                <w:sz w:val="18"/>
-              </w:rPr>
-              <w:t>−255…255; 0</w:t>
-            </w:r>
-          </w:p>
-        </w:tc>
-        <w:tc>
-          <w:tcPr>
-            <w:tcW w:type="dxa" w:w="2473"/>
-          </w:tcPr>
-          <w:p>
-            <w:pPr>
-              <w:spacing w:after="80"/>
-            </w:pPr>
-            <w:r>
-              <w:rPr>
-                <w:sz w:val="18"/>
-              </w:rPr>
-              <w:t>Offsets intensity.</w:t>
-            </w:r>
-          </w:p>
-        </w:tc>
-      </w:tr>
-      <w:tr>
-        <w:trPr>
-          <w:cantSplit/>
-        </w:trPr>
-        <w:tc>
-          <w:tcPr>
-            <w:tcW w:type="dxa" w:w="2473"/>
-          </w:tcPr>
-          <w:p>
-            <w:pPr>
-              <w:spacing w:after="80"/>
-            </w:pPr>
-            <w:r>
-              <w:rPr>
-                <w:sz w:val="18"/>
-              </w:rPr>
-              <w:t>Brightness / Contrast</w:t>
-            </w:r>
-          </w:p>
-        </w:tc>
-        <w:tc>
-          <w:tcPr>
-            <w:tcW w:type="dxa" w:w="2473"/>
-          </w:tcPr>
-          <w:p>
-            <w:pPr>
-              <w:spacing w:after="80"/>
-            </w:pPr>
-            <w:r>
-              <w:rPr>
-                <w:sz w:val="18"/>
-              </w:rPr>
-              <w:t>Contrast • slider</w:t>
-            </w:r>
-          </w:p>
-        </w:tc>
-        <w:tc>
-          <w:tcPr>
-            <w:tcW w:type="dxa" w:w="2473"/>
-          </w:tcPr>
-          <w:p>
-            <w:pPr>
-              <w:spacing w:after="80"/>
-            </w:pPr>
-            <w:r>
-              <w:rPr>
-                <w:sz w:val="18"/>
-              </w:rPr>
-              <w:t>0…3; 1; step .05</w:t>
-            </w:r>
-          </w:p>
-        </w:tc>
-        <w:tc>
-          <w:tcPr>
-            <w:tcW w:type="dxa" w:w="2473"/>
-          </w:tcPr>
-          <w:p>
-            <w:pPr>
-              <w:spacing w:after="80"/>
-            </w:pPr>
-            <w:r>
-              <w:rPr>
-                <w:sz w:val="18"/>
-              </w:rPr>
-              <w:t>Scales intensity.</w:t>
-            </w:r>
-          </w:p>
-        </w:tc>
-      </w:tr>
-      <w:tr>
-        <w:trPr>
-          <w:cantSplit/>
-        </w:trPr>
-        <w:tc>
-          <w:tcPr>
-            <w:tcW w:type="dxa" w:w="2473"/>
-          </w:tcPr>
-          <w:p>
-            <w:pPr>
-              <w:spacing w:after="80"/>
-            </w:pPr>
-            <w:r>
-              <w:rPr>
-                <w:sz w:val="18"/>
-              </w:rPr>
-              <w:t>RGB Channels</w:t>
-            </w:r>
-          </w:p>
-        </w:tc>
-        <w:tc>
-          <w:tcPr>
-            <w:tcW w:type="dxa" w:w="2473"/>
-          </w:tcPr>
-          <w:p>
-            <w:pPr>
-              <w:spacing w:after="80"/>
-            </w:pPr>
-            <w:r>
-              <w:rPr>
-                <w:sz w:val="18"/>
-              </w:rPr>
-              <w:t>R/G/B • sliders</w:t>
-            </w:r>
-          </w:p>
-        </w:tc>
-        <w:tc>
-          <w:tcPr>
-            <w:tcW w:type="dxa" w:w="2473"/>
-          </w:tcPr>
-          <w:p>
-            <w:pPr>
-              <w:spacing w:after="80"/>
-            </w:pPr>
-            <w:r>
-              <w:rPr>
-                <w:sz w:val="18"/>
-              </w:rPr>
-              <w:t>Each 0…2; 1; step .05</w:t>
-            </w:r>
-          </w:p>
-        </w:tc>
-        <w:tc>
-          <w:tcPr>
-            <w:tcW w:type="dxa" w:w="2473"/>
-          </w:tcPr>
-          <w:p>
-            <w:pPr>
-              <w:spacing w:after="80"/>
-            </w:pPr>
-            <w:r>
-              <w:rPr>
-                <w:sz w:val="18"/>
-              </w:rPr>
-              <w:t>Independent channel gains.</w:t>
-            </w:r>
-          </w:p>
-        </w:tc>
-      </w:tr>
-      <w:tr>
-        <w:trPr>
-          <w:cantSplit/>
-        </w:trPr>
-        <w:tc>
-          <w:tcPr>
-            <w:tcW w:type="dxa" w:w="2473"/>
-          </w:tcPr>
-          <w:p>
-            <w:pPr>
-              <w:spacing w:after="80"/>
-            </w:pPr>
-            <w:r>
-              <w:rPr>
-                <w:sz w:val="18"/>
-              </w:rPr>
-              <w:t>Median Filter</w:t>
-            </w:r>
-          </w:p>
-        </w:tc>
-        <w:tc>
-          <w:tcPr>
-            <w:tcW w:type="dxa" w:w="2473"/>
-          </w:tcPr>
-          <w:p>
-            <w:pPr>
-              <w:spacing w:after="80"/>
-            </w:pPr>
-            <w:r>
-              <w:rPr>
-                <w:sz w:val="18"/>
-              </w:rPr>
-              <w:t>Kernel • textbox</w:t>
-            </w:r>
-          </w:p>
-        </w:tc>
-        <w:tc>
-          <w:tcPr>
-            <w:tcW w:type="dxa" w:w="2473"/>
-          </w:tcPr>
-          <w:p>
-            <w:pPr>
-              <w:spacing w:after="80"/>
-            </w:pPr>
-            <w:r>
-              <w:rPr>
-                <w:sz w:val="18"/>
-              </w:rPr>
-              <w:t>Odd 3…31; 3</w:t>
-            </w:r>
-          </w:p>
-        </w:tc>
-        <w:tc>
-          <w:tcPr>
-            <w:tcW w:type="dxa" w:w="2473"/>
-          </w:tcPr>
-          <w:p>
-            <w:pPr>
-              <w:spacing w:after="80"/>
-            </w:pPr>
-            <w:r>
-              <w:rPr>
-                <w:sz w:val="18"/>
-              </w:rPr>
-              <w:t>Median neighborhood.</w:t>
-            </w:r>
-          </w:p>
-        </w:tc>
-      </w:tr>
-      <w:tr>
-        <w:trPr>
-          <w:cantSplit/>
-        </w:trPr>
-        <w:tc>
-          <w:tcPr>
-            <w:tcW w:type="dxa" w:w="2473"/>
-          </w:tcPr>
-          <w:p>
-            <w:pPr>
-              <w:spacing w:after="80"/>
-            </w:pPr>
-            <w:r>
-              <w:rPr>
-                <w:sz w:val="18"/>
-              </w:rPr>
-              <w:t>Gaussian Smoothing</w:t>
-            </w:r>
-          </w:p>
-        </w:tc>
-        <w:tc>
-          <w:tcPr>
-            <w:tcW w:type="dxa" w:w="2473"/>
-          </w:tcPr>
-          <w:p>
-            <w:pPr>
-              <w:spacing w:after="80"/>
-            </w:pPr>
-            <w:r>
-              <w:rPr>
-                <w:sz w:val="18"/>
-              </w:rPr>
-              <w:t>Kernel • textbox</w:t>
-            </w:r>
-          </w:p>
-        </w:tc>
-        <w:tc>
-          <w:tcPr>
-            <w:tcW w:type="dxa" w:w="2473"/>
-          </w:tcPr>
-          <w:p>
-            <w:pPr>
-              <w:spacing w:after="80"/>
-            </w:pPr>
-            <w:r>
-              <w:rPr>
-                <w:sz w:val="18"/>
-              </w:rPr>
-              <w:t>Odd 3…31; 5</w:t>
-            </w:r>
-          </w:p>
-        </w:tc>
-        <w:tc>
-          <w:tcPr>
-            <w:tcW w:type="dxa" w:w="2473"/>
-          </w:tcPr>
-          <w:p>
-            <w:pPr>
-              <w:spacing w:after="80"/>
-            </w:pPr>
-            <w:r>
-              <w:rPr>
-                <w:sz w:val="18"/>
-              </w:rPr>
-              <w:t>Smoothing neighborhood.</w:t>
-            </w:r>
-          </w:p>
-        </w:tc>
-      </w:tr>
-      <w:tr>
-        <w:trPr>
-          <w:cantSplit/>
-        </w:trPr>
-        <w:tc>
-          <w:tcPr>
-            <w:tcW w:type="dxa" w:w="2473"/>
-          </w:tcPr>
-          <w:p>
-            <w:pPr>
-              <w:spacing w:after="80"/>
-            </w:pPr>
-            <w:r>
-              <w:rPr>
-                <w:sz w:val="18"/>
-              </w:rPr>
-              <w:t>Gaussian Smoothing</w:t>
-            </w:r>
-          </w:p>
-        </w:tc>
-        <w:tc>
-          <w:tcPr>
-            <w:tcW w:type="dxa" w:w="2473"/>
-          </w:tcPr>
-          <w:p>
-            <w:pPr>
-              <w:spacing w:after="80"/>
-            </w:pPr>
-            <w:r>
-              <w:rPr>
-                <w:sz w:val="18"/>
-              </w:rPr>
-              <w:t>Sigma • textbox</w:t>
-            </w:r>
-          </w:p>
-        </w:tc>
-        <w:tc>
-          <w:tcPr>
-            <w:tcW w:type="dxa" w:w="2473"/>
-          </w:tcPr>
-          <w:p>
-            <w:pPr>
-              <w:spacing w:after="80"/>
-            </w:pPr>
-            <w:r>
-              <w:rPr>
-                <w:sz w:val="18"/>
-              </w:rPr>
-              <w:t>0…10; 0</w:t>
-            </w:r>
-          </w:p>
-        </w:tc>
-        <w:tc>
-          <w:tcPr>
-            <w:tcW w:type="dxa" w:w="2473"/>
-          </w:tcPr>
-          <w:p>
-            <w:pPr>
-              <w:spacing w:after="80"/>
-            </w:pPr>
-            <w:r>
-              <w:rPr>
-                <w:sz w:val="18"/>
-              </w:rPr>
-              <w:t>Spread; 0 = automatic.</w:t>
-            </w:r>
-          </w:p>
-        </w:tc>
-      </w:tr>
-      <w:tr>
-        <w:trPr>
-          <w:cantSplit/>
-        </w:trPr>
-        <w:tc>
-          <w:tcPr>
-            <w:tcW w:type="dxa" w:w="2473"/>
-          </w:tcPr>
-          <w:p>
-            <w:pPr>
-              <w:spacing w:after="80"/>
-            </w:pPr>
-            <w:r>
-              <w:rPr>
-                <w:sz w:val="18"/>
-              </w:rPr>
-              <w:t>Sobel</w:t>
-            </w:r>
-          </w:p>
-        </w:tc>
-        <w:tc>
-          <w:tcPr>
-            <w:tcW w:type="dxa" w:w="2473"/>
-          </w:tcPr>
-          <w:p>
-            <w:pPr>
-              <w:spacing w:after="80"/>
-            </w:pPr>
-            <w:r>
-              <w:rPr>
-                <w:sz w:val="18"/>
-              </w:rPr>
-              <w:t>Kernel • dropdown</w:t>
-            </w:r>
-          </w:p>
-        </w:tc>
-        <w:tc>
-          <w:tcPr>
-            <w:tcW w:type="dxa" w:w="2473"/>
-          </w:tcPr>
-          <w:p>
-            <w:pPr>
-              <w:spacing w:after="80"/>
-            </w:pPr>
-            <w:r>
-              <w:rPr>
-                <w:sz w:val="18"/>
-              </w:rPr>
-              <w:t>3, 5, 7; 3</w:t>
-            </w:r>
-          </w:p>
-        </w:tc>
-        <w:tc>
-          <w:tcPr>
-            <w:tcW w:type="dxa" w:w="2473"/>
-          </w:tcPr>
-          <w:p>
-            <w:pPr>
-              <w:spacing w:after="80"/>
-            </w:pPr>
-            <w:r>
-              <w:rPr>
-                <w:sz w:val="18"/>
-              </w:rPr>
-              <w:t>Derivative neighborhood.</w:t>
-            </w:r>
-          </w:p>
-        </w:tc>
-      </w:tr>
-      <w:tr>
-        <w:trPr>
-          <w:cantSplit/>
-        </w:trPr>
-        <w:tc>
-          <w:tcPr>
-            <w:tcW w:type="dxa" w:w="2473"/>
-          </w:tcPr>
-          <w:p>
-            <w:pPr>
-              <w:spacing w:after="80"/>
-            </w:pPr>
-            <w:r>
-              <w:rPr>
-                <w:sz w:val="18"/>
-              </w:rPr>
-              <w:t>Sobel</w:t>
-            </w:r>
-          </w:p>
-        </w:tc>
-        <w:tc>
-          <w:tcPr>
-            <w:tcW w:type="dxa" w:w="2473"/>
-          </w:tcPr>
-          <w:p>
-            <w:pPr>
-              <w:spacing w:after="80"/>
-            </w:pPr>
-            <w:r>
-              <w:rPr>
-                <w:sz w:val="18"/>
-              </w:rPr>
-              <w:t>Mean ratio • textbox</w:t>
-            </w:r>
-          </w:p>
-        </w:tc>
-        <w:tc>
-          <w:tcPr>
-            <w:tcW w:type="dxa" w:w="2473"/>
-          </w:tcPr>
-          <w:p>
-            <w:pPr>
-              <w:spacing w:after="80"/>
-            </w:pPr>
-            <w:r>
-              <w:rPr>
-                <w:sz w:val="18"/>
-              </w:rPr>
-              <w:t>0…10; 1</w:t>
-            </w:r>
-          </w:p>
-        </w:tc>
-        <w:tc>
-          <w:tcPr>
-            <w:tcW w:type="dxa" w:w="2473"/>
-          </w:tcPr>
-          <w:p>
-            <w:pPr>
-              <w:spacing w:after="80"/>
-            </w:pPr>
-            <w:r>
-              <w:rPr>
-                <w:sz w:val="18"/>
-              </w:rPr>
-              <w:t>Threshold multiplier.</w:t>
-            </w:r>
-          </w:p>
-        </w:tc>
-      </w:tr>
-      <w:tr>
-        <w:trPr>
-          <w:cantSplit/>
-        </w:trPr>
-        <w:tc>
-          <w:tcPr>
-            <w:tcW w:type="dxa" w:w="2473"/>
-          </w:tcPr>
-          <w:p>
-            <w:pPr>
-              <w:spacing w:after="80"/>
-            </w:pPr>
-            <w:r>
-              <w:rPr>
-                <w:sz w:val="18"/>
-              </w:rPr>
-              <w:t>Canny</w:t>
-            </w:r>
-          </w:p>
-        </w:tc>
-        <w:tc>
-          <w:tcPr>
-            <w:tcW w:type="dxa" w:w="2473"/>
-          </w:tcPr>
-          <w:p>
-            <w:pPr>
-              <w:spacing w:after="80"/>
-            </w:pPr>
-            <w:r>
-              <w:rPr>
-                <w:sz w:val="18"/>
-              </w:rPr>
-              <w:t>Threshold 1 • textbox</w:t>
-            </w:r>
-          </w:p>
-        </w:tc>
-        <w:tc>
-          <w:tcPr>
-            <w:tcW w:type="dxa" w:w="2473"/>
-          </w:tcPr>
-          <w:p>
-            <w:pPr>
-              <w:spacing w:after="80"/>
-            </w:pPr>
-            <w:r>
-              <w:rPr>
-                <w:sz w:val="18"/>
-              </w:rPr>
-              <w:t>0…255; 100</w:t>
-            </w:r>
-          </w:p>
-        </w:tc>
-        <w:tc>
-          <w:tcPr>
-            <w:tcW w:type="dxa" w:w="2473"/>
-          </w:tcPr>
-          <w:p>
-            <w:pPr>
-              <w:spacing w:after="80"/>
-            </w:pPr>
-            <w:r>
-              <w:rPr>
-                <w:sz w:val="18"/>
-              </w:rPr>
-              <w:t>Lower gradient threshold.</w:t>
-            </w:r>
-          </w:p>
-        </w:tc>
-      </w:tr>
-      <w:tr>
-        <w:trPr>
-          <w:cantSplit/>
-        </w:trPr>
-        <w:tc>
-          <w:tcPr>
-            <w:tcW w:type="dxa" w:w="2473"/>
-          </w:tcPr>
-          <w:p>
-            <w:pPr>
-              <w:spacing w:after="80"/>
-            </w:pPr>
-            <w:r>
-              <w:rPr>
-                <w:sz w:val="18"/>
-              </w:rPr>
-              <w:t>Canny</w:t>
-            </w:r>
-          </w:p>
-        </w:tc>
-        <w:tc>
-          <w:tcPr>
-            <w:tcW w:type="dxa" w:w="2473"/>
-          </w:tcPr>
-          <w:p>
-            <w:pPr>
-              <w:spacing w:after="80"/>
-            </w:pPr>
-            <w:r>
-              <w:rPr>
-                <w:sz w:val="18"/>
-              </w:rPr>
-              <w:t>Threshold 2 • textbox</w:t>
-            </w:r>
-          </w:p>
-        </w:tc>
-        <w:tc>
-          <w:tcPr>
-            <w:tcW w:type="dxa" w:w="2473"/>
-          </w:tcPr>
-          <w:p>
-            <w:pPr>
-              <w:spacing w:after="80"/>
-            </w:pPr>
-            <w:r>
-              <w:rPr>
-                <w:sz w:val="18"/>
-              </w:rPr>
-              <w:t>0…255; 200</w:t>
-            </w:r>
-          </w:p>
-        </w:tc>
-        <w:tc>
-          <w:tcPr>
-            <w:tcW w:type="dxa" w:w="2473"/>
-          </w:tcPr>
-          <w:p>
-            <w:pPr>
-              <w:spacing w:after="80"/>
-            </w:pPr>
-            <w:r>
-              <w:rPr>
-                <w:sz w:val="18"/>
-              </w:rPr>
-              <w:t>Upper; must be ≥ t1.</w:t>
-            </w:r>
-          </w:p>
-        </w:tc>
-      </w:tr>
-      <w:tr>
-        <w:trPr>
-          <w:cantSplit/>
-        </w:trPr>
-        <w:tc>
-          <w:tcPr>
-            <w:tcW w:type="dxa" w:w="2473"/>
-          </w:tcPr>
-          <w:p>
-            <w:pPr>
-              <w:spacing w:after="80"/>
-            </w:pPr>
-            <w:r>
-              <w:rPr>
-                <w:sz w:val="18"/>
-              </w:rPr>
-              <w:t>Canny</w:t>
-            </w:r>
-          </w:p>
-        </w:tc>
-        <w:tc>
-          <w:tcPr>
-            <w:tcW w:type="dxa" w:w="2473"/>
-          </w:tcPr>
-          <w:p>
-            <w:pPr>
-              <w:spacing w:after="80"/>
-            </w:pPr>
-            <w:r>
-              <w:rPr>
-                <w:sz w:val="18"/>
-              </w:rPr>
-              <w:t>Aperture • dropdown</w:t>
-            </w:r>
-          </w:p>
-        </w:tc>
-        <w:tc>
-          <w:tcPr>
-            <w:tcW w:type="dxa" w:w="2473"/>
-          </w:tcPr>
-          <w:p>
-            <w:pPr>
-              <w:spacing w:after="80"/>
-            </w:pPr>
-            <w:r>
-              <w:rPr>
-                <w:sz w:val="18"/>
-              </w:rPr>
-              <w:t>3, 5, 7; 3</w:t>
-            </w:r>
-          </w:p>
-        </w:tc>
-        <w:tc>
-          <w:tcPr>
-            <w:tcW w:type="dxa" w:w="2473"/>
-          </w:tcPr>
-          <w:p>
-            <w:pPr>
-              <w:spacing w:after="80"/>
-            </w:pPr>
-            <w:r>
-              <w:rPr>
-                <w:sz w:val="18"/>
-              </w:rPr>
-              <w:t>Derivative neighborhood.</w:t>
-            </w:r>
-          </w:p>
-        </w:tc>
-      </w:tr>
-      <w:tr>
-        <w:trPr>
-          <w:cantSplit/>
-        </w:trPr>
-        <w:tc>
-          <w:tcPr>
-            <w:tcW w:type="dxa" w:w="2473"/>
-          </w:tcPr>
-          <w:p>
-            <w:pPr>
-              <w:spacing w:after="80"/>
-            </w:pPr>
-            <w:r>
-              <w:rPr>
-                <w:sz w:val="18"/>
-              </w:rPr>
-              <w:t>Global Thresholding</w:t>
-            </w:r>
-          </w:p>
-        </w:tc>
-        <w:tc>
-          <w:tcPr>
-            <w:tcW w:type="dxa" w:w="2473"/>
-          </w:tcPr>
-          <w:p>
-            <w:pPr>
-              <w:spacing w:after="80"/>
-            </w:pPr>
-            <w:r>
-              <w:rPr>
-                <w:sz w:val="18"/>
-              </w:rPr>
-              <w:t>Threshold • slider</w:t>
-            </w:r>
-          </w:p>
-        </w:tc>
-        <w:tc>
-          <w:tcPr>
-            <w:tcW w:type="dxa" w:w="2473"/>
-          </w:tcPr>
-          <w:p>
-            <w:pPr>
-              <w:spacing w:after="80"/>
-            </w:pPr>
-            <w:r>
-              <w:rPr>
-                <w:sz w:val="18"/>
-              </w:rPr>
-              <w:t>0…255; 127; step 1</w:t>
-            </w:r>
-          </w:p>
-        </w:tc>
-        <w:tc>
-          <w:tcPr>
-            <w:tcW w:type="dxa" w:w="2473"/>
-          </w:tcPr>
-          <w:p>
-            <w:pPr>
-              <w:spacing w:after="80"/>
-            </w:pPr>
-            <w:r>
-              <w:rPr>
-                <w:sz w:val="18"/>
-              </w:rPr>
-              <w:t>Separates bright pixels.</w:t>
-            </w:r>
-          </w:p>
-        </w:tc>
-      </w:tr>
-      <w:tr>
-        <w:trPr>
-          <w:cantSplit/>
-        </w:trPr>
-        <w:tc>
-          <w:tcPr>
-            <w:tcW w:type="dxa" w:w="2473"/>
-          </w:tcPr>
-          <w:p>
-            <w:pPr>
-              <w:spacing w:after="80"/>
-            </w:pPr>
-            <w:r>
-              <w:rPr>
-                <w:sz w:val="18"/>
-              </w:rPr>
-              <w:t>Adaptive Thresholding</w:t>
-            </w:r>
-          </w:p>
-        </w:tc>
-        <w:tc>
-          <w:tcPr>
-            <w:tcW w:type="dxa" w:w="2473"/>
-          </w:tcPr>
-          <w:p>
-            <w:pPr>
-              <w:spacing w:after="80"/>
-            </w:pPr>
-            <w:r>
-              <w:rPr>
-                <w:sz w:val="18"/>
-              </w:rPr>
-              <w:t>Block • textbox</w:t>
-            </w:r>
-          </w:p>
-        </w:tc>
-        <w:tc>
-          <w:tcPr>
-            <w:tcW w:type="dxa" w:w="2473"/>
-          </w:tcPr>
-          <w:p>
-            <w:pPr>
-              <w:spacing w:after="80"/>
-            </w:pPr>
-            <w:r>
-              <w:rPr>
-                <w:sz w:val="18"/>
-              </w:rPr>
-              <w:t>Odd 3…31; 11</w:t>
-            </w:r>
-          </w:p>
-        </w:tc>
-        <w:tc>
-          <w:tcPr>
-            <w:tcW w:type="dxa" w:w="2473"/>
-          </w:tcPr>
-          <w:p>
-            <w:pPr>
-              <w:spacing w:after="80"/>
-            </w:pPr>
-            <w:r>
-              <w:rPr>
-                <w:sz w:val="18"/>
-              </w:rPr>
-              <w:t>Local neighborhood.</w:t>
-            </w:r>
-          </w:p>
-        </w:tc>
-      </w:tr>
-      <w:tr>
-        <w:trPr>
-          <w:cantSplit/>
-        </w:trPr>
-        <w:tc>
-          <w:tcPr>
-            <w:tcW w:type="dxa" w:w="2473"/>
-          </w:tcPr>
-          <w:p>
-            <w:pPr>
-              <w:spacing w:after="80"/>
-            </w:pPr>
-            <w:r>
-              <w:rPr>
-                <w:sz w:val="18"/>
-              </w:rPr>
-              <w:t>Adaptive Thresholding</w:t>
-            </w:r>
-          </w:p>
-        </w:tc>
-        <w:tc>
-          <w:tcPr>
-            <w:tcW w:type="dxa" w:w="2473"/>
-          </w:tcPr>
-          <w:p>
-            <w:pPr>
-              <w:spacing w:after="80"/>
-            </w:pPr>
-            <w:r>
-              <w:rPr>
-                <w:sz w:val="18"/>
-              </w:rPr>
-              <w:t>C • textbox</w:t>
-            </w:r>
-          </w:p>
-        </w:tc>
-        <w:tc>
-          <w:tcPr>
-            <w:tcW w:type="dxa" w:w="2473"/>
-          </w:tcPr>
-          <w:p>
-            <w:pPr>
-              <w:spacing w:after="80"/>
-            </w:pPr>
-            <w:r>
-              <w:rPr>
-                <w:sz w:val="18"/>
-              </w:rPr>
-              <w:t>−50…50; 2</w:t>
-            </w:r>
-          </w:p>
-        </w:tc>
-        <w:tc>
-          <w:tcPr>
-            <w:tcW w:type="dxa" w:w="2473"/>
-          </w:tcPr>
-          <w:p>
-            <w:pPr>
-              <w:spacing w:after="80"/>
-            </w:pPr>
-            <w:r>
-              <w:rPr>
-                <w:sz w:val="18"/>
-              </w:rPr>
-              <w:t>Subtracts from local value.</w:t>
-            </w:r>
-          </w:p>
-        </w:tc>
-      </w:tr>
-      <w:tr>
-        <w:trPr>
-          <w:cantSplit/>
-        </w:trPr>
-        <w:tc>
-          <w:tcPr>
-            <w:tcW w:type="dxa" w:w="2473"/>
-          </w:tcPr>
-          <w:p>
-            <w:pPr>
-              <w:spacing w:after="80"/>
-            </w:pPr>
-            <w:r>
-              <w:rPr>
-                <w:sz w:val="18"/>
-              </w:rPr>
-              <w:t>Adaptive Thresholding</w:t>
-            </w:r>
-          </w:p>
-        </w:tc>
-        <w:tc>
-          <w:tcPr>
-            <w:tcW w:type="dxa" w:w="2473"/>
-          </w:tcPr>
-          <w:p>
-            <w:pPr>
-              <w:spacing w:after="80"/>
-            </w:pPr>
-            <w:r>
-              <w:rPr>
-                <w:sz w:val="18"/>
-              </w:rPr>
-              <w:t>Method • dropdown</w:t>
-            </w:r>
-          </w:p>
-        </w:tc>
-        <w:tc>
-          <w:tcPr>
-            <w:tcW w:type="dxa" w:w="2473"/>
-          </w:tcPr>
-          <w:p>
-            <w:pPr>
-              <w:spacing w:after="80"/>
-            </w:pPr>
-            <w:r>
-              <w:rPr>
-                <w:sz w:val="18"/>
-              </w:rPr>
-              <w:t>Mean / Gaussian; Gaussian</w:t>
-            </w:r>
-          </w:p>
-        </w:tc>
-        <w:tc>
-          <w:tcPr>
-            <w:tcW w:type="dxa" w:w="2473"/>
-          </w:tcPr>
-          <w:p>
-            <w:pPr>
-              <w:spacing w:after="80"/>
-            </w:pPr>
-            <w:r>
-              <w:rPr>
-                <w:sz w:val="18"/>
-              </w:rPr>
-              <w:t>Local averaging method.</w:t>
-            </w:r>
-          </w:p>
-        </w:tc>
-      </w:tr>
-      <w:tr>
-        <w:trPr>
-          <w:cantSplit/>
-        </w:trPr>
-        <w:tc>
-          <w:tcPr>
-            <w:tcW w:type="dxa" w:w="2473"/>
-          </w:tcPr>
-          <w:p>
-            <w:pPr>
-              <w:spacing w:after="80"/>
-            </w:pPr>
-            <w:r>
-              <w:rPr>
-                <w:sz w:val="18"/>
-              </w:rPr>
-              <w:t>Contour Detection</w:t>
-            </w:r>
-          </w:p>
-        </w:tc>
-        <w:tc>
-          <w:tcPr>
-            <w:tcW w:type="dxa" w:w="2473"/>
-          </w:tcPr>
-          <w:p>
-            <w:pPr>
-              <w:spacing w:after="80"/>
-            </w:pPr>
-            <w:r>
-              <w:rPr>
-                <w:sz w:val="18"/>
-              </w:rPr>
-              <w:t>Threshold • slider</w:t>
-            </w:r>
-          </w:p>
-        </w:tc>
-        <w:tc>
-          <w:tcPr>
-            <w:tcW w:type="dxa" w:w="2473"/>
-          </w:tcPr>
-          <w:p>
-            <w:pPr>
-              <w:spacing w:after="80"/>
-            </w:pPr>
-            <w:r>
-              <w:rPr>
-                <w:sz w:val="18"/>
-              </w:rPr>
-              <w:t>0…255; 127; step 1</w:t>
-            </w:r>
-          </w:p>
-        </w:tc>
-        <w:tc>
-          <w:tcPr>
-            <w:tcW w:type="dxa" w:w="2473"/>
-          </w:tcPr>
-          <w:p>
-            <w:pPr>
-              <w:spacing w:after="80"/>
-            </w:pPr>
-            <w:r>
-              <w:rPr>
-                <w:sz w:val="18"/>
-              </w:rPr>
-              <w:t>Foreground for contours.</w:t>
+              <w:t>SS PLACE — INSERT SCREENSHOT HERE</w:t>
             </w:r>
           </w:p>
         </w:tc>
@@ -1633,15 +744,28 @@
     </w:tbl>
     <w:p>
       <w:pPr>
+        <w:pStyle w:val="Caption"/>
+      </w:pPr>
+      <w:r>
+        <w:t>Figure 5. Contour Detection showing green outer boundaries and its threshold control.</w:t>
+      </w:r>
+    </w:p>
+    <w:p>
+      <w:pPr>
         <w:pStyle w:val="Heading2"/>
       </w:pPr>
       <w:r>
-        <w:t>Validation and range rationale</w:t>
+        <w:t>Validation and recovery</w:t>
       </w:r>
     </w:p>
     <w:p>
       <w:r>
-        <w:t>Numeric inputs must be finite. Filter/block sizes accept simple odd integers only. Canny aperture choices reflect supported sizes; Sobel’s restricted choices, kernel maximum 31, sigma maximum 10, mean-ratio maximum 10, C limits, and Canny threshold limits are project choices, not universal OpenCV maxima. Grayscale, Histogram, Histogram Equalization, and Sharpening have no parameters.</w:t>
+        <w:t>The application checks that an image is available and that numeric settings have valid values before processing. Empty or nonnumeric input, unsupported kernel sizes, and reversed Canny thresholds produce clear feedback while preserving the last successful result. Cancelling a file dialog leaves the current work intact. Unreadable images, save failures, and unavailable cameras are handled with feedback so the user can recover.</w:t>
+      </w:r>
+    </w:p>
+    <w:p>
+      <w:r>
+        <w:t>The progress tracker records completed integration checks and user-confirmed verification. Automated checks included simulated file dialogs and cameras; they do not independently establish physical-camera behavior on every computer. A reported native macOS Save As dialog clipping issue remains documented.</w:t>
       </w:r>
     </w:p>
     <w:p>
@@ -1654,114 +778,1171 @@
         <w:pStyle w:val="Heading1"/>
       </w:pPr>
       <w:r>
-        <w:t>5. Implementation, Webcam and Verification</w:t>
-      </w:r>
-    </w:p>
-    <w:p>
-      <w:pPr>
-        <w:pStyle w:val="Heading2"/>
-      </w:pPr>
-      <w:r>
-        <w:t>Structure and execution</w:t>
+        <w:t>6. Parameter reference</w:t>
       </w:r>
     </w:p>
     <w:p>
       <w:r>
-        <w:t>main.py starts Tkinter; app.py coordinates state and callbacks. gui/ builds controls and preview. core/file_handler.py handles image I/O; core/webcam.py owns the camera. processing/ contains algorithms; utils/validators.py checks parameters. Images use NumPy uint8 arrays: BGR for color, 2D for grayscale. Full-resolution originals/results are separate from resized preview pixels.</w:t>
-      </w:r>
-    </w:p>
-    <w:p>
-      <w:pPr>
-        <w:pStyle w:val="Heading2"/>
-      </w:pPr>
-      <w:r>
-        <w:t>Webcam lifecycle</w:t>
-      </w:r>
-    </w:p>
-    <w:p>
-      <w:r>
-        <w:t>File → Access Live Webcam opens device 0 and checks the first frame. Tkinter schedules the next read 30 ms after each update; this is not a guaranteed frame rate. Take Snapshot copies the latest frame, releases the camera, and makes it the new original. Stop restores the prior static result. Both buttons appear only during capture. Failure and application exit also release the handle and cancel scheduled work.</w:t>
-      </w:r>
-    </w:p>
-    <w:p>
-      <w:pPr>
-        <w:pStyle w:val="Heading2"/>
-      </w:pPr>
-      <w:r>
-        <w:t>Stability and saving</w:t>
-      </w:r>
-    </w:p>
-    <w:p>
-      <w:r>
-        <w:t>No-image actions, invalid parameters, unreadable files, cancelled dialogs, and camera failures give feedback or return safely. Processing/saving during live capture requires snapshot or Stop first. Save As (menu or button) copies the displayed result before opening the dialog, so a pending slider callback cannot change the chosen pixels. PNG/BMP preserve tested pixels; JPEG is lossy.</w:t>
-      </w:r>
-    </w:p>
-    <w:p>
-      <w:pPr>
-        <w:pStyle w:val="Heading2"/>
-      </w:pPr>
-      <w:r>
-        <w:t>Verification and limitations</w:t>
-      </w:r>
-    </w:p>
-    <w:p>
-      <w:r>
-        <w:t>M8 recorded 914 regression checks and 470 integration checks, including all operations, tiny/thin images, repeated use, saving, and invalid cases. Automated GUI checks used real Tk windows with simulated dialogs/cameras. The user confirmed M8 verification; individual manual hardware results were not recorded. Native macOS Save As clipping remains a known visual issue. Driver reads may briefly block the event loop.</w:t>
+        <w:t>Ranges below are the values accepted by this application. Selecting an operation loads its defaults. Sliders update live; edited text fields and parameter dropdowns take effect when Apply is clicked.</w:t>
       </w:r>
     </w:p>
     <w:tbl>
       <w:tblPr>
         <w:tblStyle w:val="TableGrid"/>
         <w:tblW w:type="auto" w:w="0"/>
-        <w:jc w:val="center"/>
+        <w:tblLayout w:type="fixed"/>
         <w:tblLook w:firstColumn="1" w:firstRow="1" w:lastColumn="0" w:lastRow="0" w:noHBand="0" w:noVBand="1" w:val="04A0"/>
       </w:tblPr>
       <w:tblGrid>
-        <w:gridCol w:w="9893"/>
+        <w:gridCol w:w="1901"/>
+        <w:gridCol w:w="2333"/>
+        <w:gridCol w:w="2275"/>
+        <w:gridCol w:w="3283"/>
       </w:tblGrid>
       <w:tr>
         <w:trPr>
-          <w:trHeight w:val="2448" w:hRule="exact"/>
+          <w:tblHeader/>
+          <w:cantSplit/>
         </w:trPr>
         <w:tc>
           <w:tcPr>
-            <w:tcW w:type="dxa" w:w="9893"/>
-            <w:vAlign w:val="center"/>
+            <w:tcW w:type="dxa" w:w="1901"/>
+            <w:shd w:fill="234E70"/>
           </w:tcPr>
           <w:p>
             <w:pPr>
-              <w:jc w:val="center"/>
+              <w:spacing w:after="60" w:before="60"/>
             </w:pPr>
             <w:r>
               <w:rPr>
-                <w:i/>
+                <w:b/>
+                <w:color w:val="FFFFFF"/>
+                <w:sz w:val="18"/>
               </w:rPr>
-              <w:t>[ Insert screenshot here ]</w:t>
+              <w:t>Operation</w:t>
+            </w:r>
+          </w:p>
+        </w:tc>
+        <w:tc>
+          <w:tcPr>
+            <w:tcW w:type="dxa" w:w="2333"/>
+            <w:shd w:fill="234E70"/>
+          </w:tcPr>
+          <w:p>
+            <w:pPr>
+              <w:spacing w:after="60" w:before="60"/>
+            </w:pPr>
+            <w:r>
+              <w:rPr>
+                <w:b/>
+                <w:color w:val="FFFFFF"/>
+                <w:sz w:val="18"/>
+              </w:rPr>
+              <w:t>Parameter / control</w:t>
+            </w:r>
+          </w:p>
+        </w:tc>
+        <w:tc>
+          <w:tcPr>
+            <w:tcW w:type="dxa" w:w="2275"/>
+            <w:shd w:fill="234E70"/>
+          </w:tcPr>
+          <w:p>
+            <w:pPr>
+              <w:spacing w:after="60" w:before="60"/>
+            </w:pPr>
+            <w:r>
+              <w:rPr>
+                <w:b/>
+                <w:color w:val="FFFFFF"/>
+                <w:sz w:val="18"/>
+              </w:rPr>
+              <w:t>Range; default</w:t>
+            </w:r>
+          </w:p>
+        </w:tc>
+        <w:tc>
+          <w:tcPr>
+            <w:tcW w:type="dxa" w:w="3283"/>
+            <w:shd w:fill="234E70"/>
+          </w:tcPr>
+          <w:p>
+            <w:pPr>
+              <w:spacing w:after="60" w:before="60"/>
+            </w:pPr>
+            <w:r>
+              <w:rPr>
+                <w:b/>
+                <w:color w:val="FFFFFF"/>
+                <w:sz w:val="18"/>
+              </w:rPr>
+              <w:t>Effect</w:t>
+            </w:r>
+          </w:p>
+        </w:tc>
+      </w:tr>
+      <w:tr>
+        <w:trPr>
+          <w:cantSplit/>
+        </w:trPr>
+        <w:tc>
+          <w:tcPr>
+            <w:tcW w:type="dxa" w:w="1901"/>
+          </w:tcPr>
+          <w:p>
+            <w:pPr>
+              <w:spacing w:after="60" w:before="60"/>
+            </w:pPr>
+            <w:r>
+              <w:rPr>
+                <w:sz w:val="18"/>
+              </w:rPr>
+              <w:t>Brightness / Contrast</w:t>
+            </w:r>
+          </w:p>
+        </w:tc>
+        <w:tc>
+          <w:tcPr>
+            <w:tcW w:type="dxa" w:w="2333"/>
+          </w:tcPr>
+          <w:p>
+            <w:pPr>
+              <w:spacing w:after="60" w:before="60"/>
+            </w:pPr>
+            <w:r>
+              <w:rPr>
+                <w:sz w:val="18"/>
+              </w:rPr>
+              <w:t>Brightness · slider</w:t>
+            </w:r>
+          </w:p>
+        </w:tc>
+        <w:tc>
+          <w:tcPr>
+            <w:tcW w:type="dxa" w:w="2275"/>
+          </w:tcPr>
+          <w:p>
+            <w:pPr>
+              <w:spacing w:after="60" w:before="60"/>
+            </w:pPr>
+            <w:r>
+              <w:rPr>
+                <w:sz w:val="18"/>
+              </w:rPr>
+              <w:t>−255 to 255; 0</w:t>
+            </w:r>
+          </w:p>
+        </w:tc>
+        <w:tc>
+          <w:tcPr>
+            <w:tcW w:type="dxa" w:w="3283"/>
+          </w:tcPr>
+          <w:p>
+            <w:pPr>
+              <w:spacing w:after="60" w:before="60"/>
+            </w:pPr>
+            <w:r>
+              <w:rPr>
+                <w:sz w:val="18"/>
+              </w:rPr>
+              <w:t>Lightens or darkens.</w:t>
+            </w:r>
+          </w:p>
+        </w:tc>
+      </w:tr>
+      <w:tr>
+        <w:trPr>
+          <w:cantSplit/>
+        </w:trPr>
+        <w:tc>
+          <w:tcPr>
+            <w:tcW w:type="dxa" w:w="1901"/>
+          </w:tcPr>
+          <w:p>
+            <w:pPr>
+              <w:spacing w:after="60" w:before="60"/>
+            </w:pPr>
+            <w:r>
+              <w:rPr>
+                <w:sz w:val="18"/>
+              </w:rPr>
+              <w:t>Brightness / Contrast</w:t>
+            </w:r>
+          </w:p>
+        </w:tc>
+        <w:tc>
+          <w:tcPr>
+            <w:tcW w:type="dxa" w:w="2333"/>
+          </w:tcPr>
+          <w:p>
+            <w:pPr>
+              <w:spacing w:after="60" w:before="60"/>
+            </w:pPr>
+            <w:r>
+              <w:rPr>
+                <w:sz w:val="18"/>
+              </w:rPr>
+              <w:t>Contrast · slider</w:t>
+            </w:r>
+          </w:p>
+        </w:tc>
+        <w:tc>
+          <w:tcPr>
+            <w:tcW w:type="dxa" w:w="2275"/>
+          </w:tcPr>
+          <w:p>
+            <w:pPr>
+              <w:spacing w:after="60" w:before="60"/>
+            </w:pPr>
+            <w:r>
+              <w:rPr>
+                <w:sz w:val="18"/>
+              </w:rPr>
+              <w:t>0 to 3; 1</w:t>
+            </w:r>
+          </w:p>
+        </w:tc>
+        <w:tc>
+          <w:tcPr>
+            <w:tcW w:type="dxa" w:w="3283"/>
+          </w:tcPr>
+          <w:p>
+            <w:pPr>
+              <w:spacing w:after="60" w:before="60"/>
+            </w:pPr>
+            <w:r>
+              <w:rPr>
+                <w:sz w:val="18"/>
+              </w:rPr>
+              <w:t>Scales intensity differences.</w:t>
+            </w:r>
+          </w:p>
+        </w:tc>
+      </w:tr>
+      <w:tr>
+        <w:trPr>
+          <w:cantSplit/>
+        </w:trPr>
+        <w:tc>
+          <w:tcPr>
+            <w:tcW w:type="dxa" w:w="1901"/>
+          </w:tcPr>
+          <w:p>
+            <w:pPr>
+              <w:spacing w:after="60" w:before="60"/>
+            </w:pPr>
+            <w:r>
+              <w:rPr>
+                <w:sz w:val="18"/>
+              </w:rPr>
+              <w:t>RGB Channels</w:t>
+            </w:r>
+          </w:p>
+        </w:tc>
+        <w:tc>
+          <w:tcPr>
+            <w:tcW w:type="dxa" w:w="2333"/>
+          </w:tcPr>
+          <w:p>
+            <w:pPr>
+              <w:spacing w:after="60" w:before="60"/>
+            </w:pPr>
+            <w:r>
+              <w:rPr>
+                <w:sz w:val="18"/>
+              </w:rPr>
+              <w:t>R / G / B · sliders</w:t>
+            </w:r>
+          </w:p>
+        </w:tc>
+        <w:tc>
+          <w:tcPr>
+            <w:tcW w:type="dxa" w:w="2275"/>
+          </w:tcPr>
+          <w:p>
+            <w:pPr>
+              <w:spacing w:after="60" w:before="60"/>
+            </w:pPr>
+            <w:r>
+              <w:rPr>
+                <w:sz w:val="18"/>
+              </w:rPr>
+              <w:t>Each 0 to 2; 1</w:t>
+            </w:r>
+          </w:p>
+        </w:tc>
+        <w:tc>
+          <w:tcPr>
+            <w:tcW w:type="dxa" w:w="3283"/>
+          </w:tcPr>
+          <w:p>
+            <w:pPr>
+              <w:spacing w:after="60" w:before="60"/>
+            </w:pPr>
+            <w:r>
+              <w:rPr>
+                <w:sz w:val="18"/>
+              </w:rPr>
+              <w:t>Changes each color’s contribution.</w:t>
+            </w:r>
+          </w:p>
+        </w:tc>
+      </w:tr>
+      <w:tr>
+        <w:trPr>
+          <w:cantSplit/>
+        </w:trPr>
+        <w:tc>
+          <w:tcPr>
+            <w:tcW w:type="dxa" w:w="1901"/>
+          </w:tcPr>
+          <w:p>
+            <w:pPr>
+              <w:spacing w:after="60" w:before="60"/>
+            </w:pPr>
+            <w:r>
+              <w:rPr>
+                <w:sz w:val="18"/>
+              </w:rPr>
+              <w:t>Median Filter</w:t>
+            </w:r>
+          </w:p>
+        </w:tc>
+        <w:tc>
+          <w:tcPr>
+            <w:tcW w:type="dxa" w:w="2333"/>
+          </w:tcPr>
+          <w:p>
+            <w:pPr>
+              <w:spacing w:after="60" w:before="60"/>
+            </w:pPr>
+            <w:r>
+              <w:rPr>
+                <w:sz w:val="18"/>
+              </w:rPr>
+              <w:t>Kernel · text field</w:t>
+            </w:r>
+          </w:p>
+        </w:tc>
+        <w:tc>
+          <w:tcPr>
+            <w:tcW w:type="dxa" w:w="2275"/>
+          </w:tcPr>
+          <w:p>
+            <w:pPr>
+              <w:spacing w:after="60" w:before="60"/>
+            </w:pPr>
+            <w:r>
+              <w:rPr>
+                <w:sz w:val="18"/>
+              </w:rPr>
+              <w:t>Odd 3–31; 3</w:t>
+            </w:r>
+          </w:p>
+        </w:tc>
+        <w:tc>
+          <w:tcPr>
+            <w:tcW w:type="dxa" w:w="3283"/>
+          </w:tcPr>
+          <w:p>
+            <w:pPr>
+              <w:spacing w:after="60" w:before="60"/>
+            </w:pPr>
+            <w:r>
+              <w:rPr>
+                <w:sz w:val="18"/>
+              </w:rPr>
+              <w:t>Sets noise-filter neighborhood.</w:t>
+            </w:r>
+          </w:p>
+        </w:tc>
+      </w:tr>
+      <w:tr>
+        <w:trPr>
+          <w:cantSplit/>
+        </w:trPr>
+        <w:tc>
+          <w:tcPr>
+            <w:tcW w:type="dxa" w:w="1901"/>
+          </w:tcPr>
+          <w:p>
+            <w:pPr>
+              <w:spacing w:after="60" w:before="60"/>
+            </w:pPr>
+            <w:r>
+              <w:rPr>
+                <w:sz w:val="18"/>
+              </w:rPr>
+              <w:t>Gaussian Smoothing</w:t>
+            </w:r>
+          </w:p>
+        </w:tc>
+        <w:tc>
+          <w:tcPr>
+            <w:tcW w:type="dxa" w:w="2333"/>
+          </w:tcPr>
+          <w:p>
+            <w:pPr>
+              <w:spacing w:after="60" w:before="60"/>
+            </w:pPr>
+            <w:r>
+              <w:rPr>
+                <w:sz w:val="18"/>
+              </w:rPr>
+              <w:t>Kernel · text field</w:t>
+            </w:r>
+          </w:p>
+        </w:tc>
+        <w:tc>
+          <w:tcPr>
+            <w:tcW w:type="dxa" w:w="2275"/>
+          </w:tcPr>
+          <w:p>
+            <w:pPr>
+              <w:spacing w:after="60" w:before="60"/>
+            </w:pPr>
+            <w:r>
+              <w:rPr>
+                <w:sz w:val="18"/>
+              </w:rPr>
+              <w:t>Odd 3–31; 5</w:t>
+            </w:r>
+          </w:p>
+        </w:tc>
+        <w:tc>
+          <w:tcPr>
+            <w:tcW w:type="dxa" w:w="3283"/>
+          </w:tcPr>
+          <w:p>
+            <w:pPr>
+              <w:spacing w:after="60" w:before="60"/>
+            </w:pPr>
+            <w:r>
+              <w:rPr>
+                <w:sz w:val="18"/>
+              </w:rPr>
+              <w:t>Sets smoothing neighborhood.</w:t>
+            </w:r>
+          </w:p>
+        </w:tc>
+      </w:tr>
+      <w:tr>
+        <w:trPr>
+          <w:cantSplit/>
+        </w:trPr>
+        <w:tc>
+          <w:tcPr>
+            <w:tcW w:type="dxa" w:w="1901"/>
+          </w:tcPr>
+          <w:p>
+            <w:pPr>
+              <w:spacing w:after="60" w:before="60"/>
+            </w:pPr>
+            <w:r>
+              <w:rPr>
+                <w:sz w:val="18"/>
+              </w:rPr>
+              <w:t>Gaussian Smoothing</w:t>
+            </w:r>
+          </w:p>
+        </w:tc>
+        <w:tc>
+          <w:tcPr>
+            <w:tcW w:type="dxa" w:w="2333"/>
+          </w:tcPr>
+          <w:p>
+            <w:pPr>
+              <w:spacing w:after="60" w:before="60"/>
+            </w:pPr>
+            <w:r>
+              <w:rPr>
+                <w:sz w:val="18"/>
+              </w:rPr>
+              <w:t>Sigma · text field</w:t>
+            </w:r>
+          </w:p>
+        </w:tc>
+        <w:tc>
+          <w:tcPr>
+            <w:tcW w:type="dxa" w:w="2275"/>
+          </w:tcPr>
+          <w:p>
+            <w:pPr>
+              <w:spacing w:after="60" w:before="60"/>
+            </w:pPr>
+            <w:r>
+              <w:rPr>
+                <w:sz w:val="18"/>
+              </w:rPr>
+              <w:t>0 to 10; 0</w:t>
+            </w:r>
+          </w:p>
+        </w:tc>
+        <w:tc>
+          <w:tcPr>
+            <w:tcW w:type="dxa" w:w="3283"/>
+          </w:tcPr>
+          <w:p>
+            <w:pPr>
+              <w:spacing w:after="60" w:before="60"/>
+            </w:pPr>
+            <w:r>
+              <w:rPr>
+                <w:sz w:val="18"/>
+              </w:rPr>
+              <w:t>Controls spread; 0 = automatic.</w:t>
+            </w:r>
+          </w:p>
+        </w:tc>
+      </w:tr>
+      <w:tr>
+        <w:trPr>
+          <w:cantSplit/>
+        </w:trPr>
+        <w:tc>
+          <w:tcPr>
+            <w:tcW w:type="dxa" w:w="1901"/>
+          </w:tcPr>
+          <w:p>
+            <w:pPr>
+              <w:spacing w:after="60" w:before="60"/>
+            </w:pPr>
+            <w:r>
+              <w:rPr>
+                <w:sz w:val="18"/>
+              </w:rPr>
+              <w:t>Sobel</w:t>
+            </w:r>
+          </w:p>
+        </w:tc>
+        <w:tc>
+          <w:tcPr>
+            <w:tcW w:type="dxa" w:w="2333"/>
+          </w:tcPr>
+          <w:p>
+            <w:pPr>
+              <w:spacing w:after="60" w:before="60"/>
+            </w:pPr>
+            <w:r>
+              <w:rPr>
+                <w:sz w:val="18"/>
+              </w:rPr>
+              <w:t>Kernel · dropdown</w:t>
+            </w:r>
+          </w:p>
+        </w:tc>
+        <w:tc>
+          <w:tcPr>
+            <w:tcW w:type="dxa" w:w="2275"/>
+          </w:tcPr>
+          <w:p>
+            <w:pPr>
+              <w:spacing w:after="60" w:before="60"/>
+            </w:pPr>
+            <w:r>
+              <w:rPr>
+                <w:sz w:val="18"/>
+              </w:rPr>
+              <w:t>3, 5, 7; 3</w:t>
+            </w:r>
+          </w:p>
+        </w:tc>
+        <w:tc>
+          <w:tcPr>
+            <w:tcW w:type="dxa" w:w="3283"/>
+          </w:tcPr>
+          <w:p>
+            <w:pPr>
+              <w:spacing w:after="60" w:before="60"/>
+            </w:pPr>
+            <w:r>
+              <w:rPr>
+                <w:sz w:val="18"/>
+              </w:rPr>
+              <w:t>Sets edge-measurement neighborhood.</w:t>
+            </w:r>
+          </w:p>
+        </w:tc>
+      </w:tr>
+      <w:tr>
+        <w:trPr>
+          <w:cantSplit/>
+        </w:trPr>
+        <w:tc>
+          <w:tcPr>
+            <w:tcW w:type="dxa" w:w="1901"/>
+          </w:tcPr>
+          <w:p>
+            <w:pPr>
+              <w:spacing w:after="60" w:before="60"/>
+            </w:pPr>
+            <w:r>
+              <w:rPr>
+                <w:sz w:val="18"/>
+              </w:rPr>
+              <w:t>Sobel</w:t>
+            </w:r>
+          </w:p>
+        </w:tc>
+        <w:tc>
+          <w:tcPr>
+            <w:tcW w:type="dxa" w:w="2333"/>
+          </w:tcPr>
+          <w:p>
+            <w:pPr>
+              <w:spacing w:after="60" w:before="60"/>
+            </w:pPr>
+            <w:r>
+              <w:rPr>
+                <w:sz w:val="18"/>
+              </w:rPr>
+              <w:t>Mean ratio · text field</w:t>
+            </w:r>
+          </w:p>
+        </w:tc>
+        <w:tc>
+          <w:tcPr>
+            <w:tcW w:type="dxa" w:w="2275"/>
+          </w:tcPr>
+          <w:p>
+            <w:pPr>
+              <w:spacing w:after="60" w:before="60"/>
+            </w:pPr>
+            <w:r>
+              <w:rPr>
+                <w:sz w:val="18"/>
+              </w:rPr>
+              <w:t>0 to 10; 1</w:t>
+            </w:r>
+          </w:p>
+        </w:tc>
+        <w:tc>
+          <w:tcPr>
+            <w:tcW w:type="dxa" w:w="3283"/>
+          </w:tcPr>
+          <w:p>
+            <w:pPr>
+              <w:spacing w:after="60" w:before="60"/>
+            </w:pPr>
+            <w:r>
+              <w:rPr>
+                <w:sz w:val="18"/>
+              </w:rPr>
+              <w:t>Higher values reject weaker edges.</w:t>
+            </w:r>
+          </w:p>
+        </w:tc>
+      </w:tr>
+      <w:tr>
+        <w:trPr>
+          <w:cantSplit/>
+        </w:trPr>
+        <w:tc>
+          <w:tcPr>
+            <w:tcW w:type="dxa" w:w="1901"/>
+          </w:tcPr>
+          <w:p>
+            <w:pPr>
+              <w:spacing w:after="60" w:before="60"/>
+            </w:pPr>
+            <w:r>
+              <w:rPr>
+                <w:sz w:val="18"/>
+              </w:rPr>
+              <w:t>Canny</w:t>
+            </w:r>
+          </w:p>
+        </w:tc>
+        <w:tc>
+          <w:tcPr>
+            <w:tcW w:type="dxa" w:w="2333"/>
+          </w:tcPr>
+          <w:p>
+            <w:pPr>
+              <w:spacing w:after="60" w:before="60"/>
+            </w:pPr>
+            <w:r>
+              <w:rPr>
+                <w:sz w:val="18"/>
+              </w:rPr>
+              <w:t>Low threshold · text field</w:t>
+            </w:r>
+          </w:p>
+        </w:tc>
+        <w:tc>
+          <w:tcPr>
+            <w:tcW w:type="dxa" w:w="2275"/>
+          </w:tcPr>
+          <w:p>
+            <w:pPr>
+              <w:spacing w:after="60" w:before="60"/>
+            </w:pPr>
+            <w:r>
+              <w:rPr>
+                <w:sz w:val="18"/>
+              </w:rPr>
+              <w:t>0 to 255; 100</w:t>
+            </w:r>
+          </w:p>
+        </w:tc>
+        <w:tc>
+          <w:tcPr>
+            <w:tcW w:type="dxa" w:w="3283"/>
+          </w:tcPr>
+          <w:p>
+            <w:pPr>
+              <w:spacing w:after="60" w:before="60"/>
+            </w:pPr>
+            <w:r>
+              <w:rPr>
+                <w:sz w:val="18"/>
+              </w:rPr>
+              <w:t>Sets lower edge threshold.</w:t>
+            </w:r>
+          </w:p>
+        </w:tc>
+      </w:tr>
+      <w:tr>
+        <w:trPr>
+          <w:cantSplit/>
+        </w:trPr>
+        <w:tc>
+          <w:tcPr>
+            <w:tcW w:type="dxa" w:w="1901"/>
+          </w:tcPr>
+          <w:p>
+            <w:pPr>
+              <w:spacing w:after="60" w:before="60"/>
+            </w:pPr>
+            <w:r>
+              <w:rPr>
+                <w:sz w:val="18"/>
+              </w:rPr>
+              <w:t>Canny</w:t>
+            </w:r>
+          </w:p>
+        </w:tc>
+        <w:tc>
+          <w:tcPr>
+            <w:tcW w:type="dxa" w:w="2333"/>
+          </w:tcPr>
+          <w:p>
+            <w:pPr>
+              <w:spacing w:after="60" w:before="60"/>
+            </w:pPr>
+            <w:r>
+              <w:rPr>
+                <w:sz w:val="18"/>
+              </w:rPr>
+              <w:t>High threshold · text field</w:t>
+            </w:r>
+          </w:p>
+        </w:tc>
+        <w:tc>
+          <w:tcPr>
+            <w:tcW w:type="dxa" w:w="2275"/>
+          </w:tcPr>
+          <w:p>
+            <w:pPr>
+              <w:spacing w:after="60" w:before="60"/>
+            </w:pPr>
+            <w:r>
+              <w:rPr>
+                <w:sz w:val="18"/>
+              </w:rPr>
+              <w:t>0 to 255; 200</w:t>
+            </w:r>
+          </w:p>
+        </w:tc>
+        <w:tc>
+          <w:tcPr>
+            <w:tcW w:type="dxa" w:w="3283"/>
+          </w:tcPr>
+          <w:p>
+            <w:pPr>
+              <w:spacing w:after="60" w:before="60"/>
+            </w:pPr>
+            <w:r>
+              <w:rPr>
+                <w:sz w:val="18"/>
+              </w:rPr>
+              <w:t>Sets strong-edge threshold; ≥ low.</w:t>
+            </w:r>
+          </w:p>
+        </w:tc>
+      </w:tr>
+      <w:tr>
+        <w:trPr>
+          <w:cantSplit/>
+        </w:trPr>
+        <w:tc>
+          <w:tcPr>
+            <w:tcW w:type="dxa" w:w="1901"/>
+          </w:tcPr>
+          <w:p>
+            <w:pPr>
+              <w:spacing w:after="60" w:before="60"/>
+            </w:pPr>
+            <w:r>
+              <w:rPr>
+                <w:sz w:val="18"/>
+              </w:rPr>
+              <w:t>Canny</w:t>
+            </w:r>
+          </w:p>
+        </w:tc>
+        <w:tc>
+          <w:tcPr>
+            <w:tcW w:type="dxa" w:w="2333"/>
+          </w:tcPr>
+          <w:p>
+            <w:pPr>
+              <w:spacing w:after="60" w:before="60"/>
+            </w:pPr>
+            <w:r>
+              <w:rPr>
+                <w:sz w:val="18"/>
+              </w:rPr>
+              <w:t>Aperture · dropdown</w:t>
+            </w:r>
+          </w:p>
+        </w:tc>
+        <w:tc>
+          <w:tcPr>
+            <w:tcW w:type="dxa" w:w="2275"/>
+          </w:tcPr>
+          <w:p>
+            <w:pPr>
+              <w:spacing w:after="60" w:before="60"/>
+            </w:pPr>
+            <w:r>
+              <w:rPr>
+                <w:sz w:val="18"/>
+              </w:rPr>
+              <w:t>3, 5, 7; 3</w:t>
+            </w:r>
+          </w:p>
+        </w:tc>
+        <w:tc>
+          <w:tcPr>
+            <w:tcW w:type="dxa" w:w="3283"/>
+          </w:tcPr>
+          <w:p>
+            <w:pPr>
+              <w:spacing w:after="60" w:before="60"/>
+            </w:pPr>
+            <w:r>
+              <w:rPr>
+                <w:sz w:val="18"/>
+              </w:rPr>
+              <w:t>Sets edge-measurement neighborhood.</w:t>
+            </w:r>
+          </w:p>
+        </w:tc>
+      </w:tr>
+      <w:tr>
+        <w:trPr>
+          <w:cantSplit/>
+        </w:trPr>
+        <w:tc>
+          <w:tcPr>
+            <w:tcW w:type="dxa" w:w="1901"/>
+          </w:tcPr>
+          <w:p>
+            <w:pPr>
+              <w:spacing w:after="60" w:before="60"/>
+            </w:pPr>
+            <w:r>
+              <w:rPr>
+                <w:sz w:val="18"/>
+              </w:rPr>
+              <w:t>Global / Contours</w:t>
+            </w:r>
+          </w:p>
+        </w:tc>
+        <w:tc>
+          <w:tcPr>
+            <w:tcW w:type="dxa" w:w="2333"/>
+          </w:tcPr>
+          <w:p>
+            <w:pPr>
+              <w:spacing w:after="60" w:before="60"/>
+            </w:pPr>
+            <w:r>
+              <w:rPr>
+                <w:sz w:val="18"/>
+              </w:rPr>
+              <w:t>Threshold · slider</w:t>
+            </w:r>
+          </w:p>
+        </w:tc>
+        <w:tc>
+          <w:tcPr>
+            <w:tcW w:type="dxa" w:w="2275"/>
+          </w:tcPr>
+          <w:p>
+            <w:pPr>
+              <w:spacing w:after="60" w:before="60"/>
+            </w:pPr>
+            <w:r>
+              <w:rPr>
+                <w:sz w:val="18"/>
+              </w:rPr>
+              <w:t>0 to 255; 127</w:t>
+            </w:r>
+          </w:p>
+        </w:tc>
+        <w:tc>
+          <w:tcPr>
+            <w:tcW w:type="dxa" w:w="3283"/>
+          </w:tcPr>
+          <w:p>
+            <w:pPr>
+              <w:spacing w:after="60" w:before="60"/>
+            </w:pPr>
+            <w:r>
+              <w:rPr>
+                <w:sz w:val="18"/>
+              </w:rPr>
+              <w:t>Selects bright foreground.</w:t>
+            </w:r>
+          </w:p>
+        </w:tc>
+      </w:tr>
+      <w:tr>
+        <w:trPr>
+          <w:cantSplit/>
+        </w:trPr>
+        <w:tc>
+          <w:tcPr>
+            <w:tcW w:type="dxa" w:w="1901"/>
+          </w:tcPr>
+          <w:p>
+            <w:pPr>
+              <w:spacing w:after="60" w:before="60"/>
+            </w:pPr>
+            <w:r>
+              <w:rPr>
+                <w:sz w:val="18"/>
+              </w:rPr>
+              <w:t>Adaptive Thresholding</w:t>
+            </w:r>
+          </w:p>
+        </w:tc>
+        <w:tc>
+          <w:tcPr>
+            <w:tcW w:type="dxa" w:w="2333"/>
+          </w:tcPr>
+          <w:p>
+            <w:pPr>
+              <w:spacing w:after="60" w:before="60"/>
+            </w:pPr>
+            <w:r>
+              <w:rPr>
+                <w:sz w:val="18"/>
+              </w:rPr>
+              <w:t>Block · text field</w:t>
+            </w:r>
+          </w:p>
+        </w:tc>
+        <w:tc>
+          <w:tcPr>
+            <w:tcW w:type="dxa" w:w="2275"/>
+          </w:tcPr>
+          <w:p>
+            <w:pPr>
+              <w:spacing w:after="60" w:before="60"/>
+            </w:pPr>
+            <w:r>
+              <w:rPr>
+                <w:sz w:val="18"/>
+              </w:rPr>
+              <w:t>Odd 3–31; 11</w:t>
+            </w:r>
+          </w:p>
+        </w:tc>
+        <w:tc>
+          <w:tcPr>
+            <w:tcW w:type="dxa" w:w="3283"/>
+          </w:tcPr>
+          <w:p>
+            <w:pPr>
+              <w:spacing w:after="60" w:before="60"/>
+            </w:pPr>
+            <w:r>
+              <w:rPr>
+                <w:sz w:val="18"/>
+              </w:rPr>
+              <w:t>Sets local neighborhood.</w:t>
+            </w:r>
+          </w:p>
+        </w:tc>
+      </w:tr>
+      <w:tr>
+        <w:trPr>
+          <w:cantSplit/>
+        </w:trPr>
+        <w:tc>
+          <w:tcPr>
+            <w:tcW w:type="dxa" w:w="1901"/>
+          </w:tcPr>
+          <w:p>
+            <w:pPr>
+              <w:spacing w:after="60" w:before="60"/>
+            </w:pPr>
+            <w:r>
+              <w:rPr>
+                <w:sz w:val="18"/>
+              </w:rPr>
+              <w:t>Adaptive Thresholding</w:t>
+            </w:r>
+          </w:p>
+        </w:tc>
+        <w:tc>
+          <w:tcPr>
+            <w:tcW w:type="dxa" w:w="2333"/>
+          </w:tcPr>
+          <w:p>
+            <w:pPr>
+              <w:spacing w:after="60" w:before="60"/>
+            </w:pPr>
+            <w:r>
+              <w:rPr>
+                <w:sz w:val="18"/>
+              </w:rPr>
+              <w:t>C · text field</w:t>
+            </w:r>
+          </w:p>
+        </w:tc>
+        <w:tc>
+          <w:tcPr>
+            <w:tcW w:type="dxa" w:w="2275"/>
+          </w:tcPr>
+          <w:p>
+            <w:pPr>
+              <w:spacing w:after="60" w:before="60"/>
+            </w:pPr>
+            <w:r>
+              <w:rPr>
+                <w:sz w:val="18"/>
+              </w:rPr>
+              <w:t>−50 to 50; 2</w:t>
+            </w:r>
+          </w:p>
+        </w:tc>
+        <w:tc>
+          <w:tcPr>
+            <w:tcW w:type="dxa" w:w="3283"/>
+          </w:tcPr>
+          <w:p>
+            <w:pPr>
+              <w:spacing w:after="60" w:before="60"/>
+            </w:pPr>
+            <w:r>
+              <w:rPr>
+                <w:sz w:val="18"/>
+              </w:rPr>
+              <w:t>Adjusts local threshold.</w:t>
+            </w:r>
+          </w:p>
+        </w:tc>
+      </w:tr>
+      <w:tr>
+        <w:trPr>
+          <w:cantSplit/>
+        </w:trPr>
+        <w:tc>
+          <w:tcPr>
+            <w:tcW w:type="dxa" w:w="1901"/>
+          </w:tcPr>
+          <w:p>
+            <w:pPr>
+              <w:spacing w:after="60" w:before="60"/>
+            </w:pPr>
+            <w:r>
+              <w:rPr>
+                <w:sz w:val="18"/>
+              </w:rPr>
+              <w:t>Adaptive Thresholding</w:t>
+            </w:r>
+          </w:p>
+        </w:tc>
+        <w:tc>
+          <w:tcPr>
+            <w:tcW w:type="dxa" w:w="2333"/>
+          </w:tcPr>
+          <w:p>
+            <w:pPr>
+              <w:spacing w:after="60" w:before="60"/>
+            </w:pPr>
+            <w:r>
+              <w:rPr>
+                <w:sz w:val="18"/>
+              </w:rPr>
+              <w:t>Method · dropdown</w:t>
+            </w:r>
+          </w:p>
+        </w:tc>
+        <w:tc>
+          <w:tcPr>
+            <w:tcW w:type="dxa" w:w="2275"/>
+          </w:tcPr>
+          <w:p>
+            <w:pPr>
+              <w:spacing w:after="60" w:before="60"/>
+            </w:pPr>
+            <w:r>
+              <w:rPr>
+                <w:sz w:val="18"/>
+              </w:rPr>
+              <w:t>Mean / Gaussian; Gaussian</w:t>
+            </w:r>
+          </w:p>
+        </w:tc>
+        <w:tc>
+          <w:tcPr>
+            <w:tcW w:type="dxa" w:w="3283"/>
+          </w:tcPr>
+          <w:p>
+            <w:pPr>
+              <w:spacing w:after="60" w:before="60"/>
+            </w:pPr>
+            <w:r>
+              <w:rPr>
+                <w:sz w:val="18"/>
+              </w:rPr>
+              <w:t>Chooses local averaging method.</w:t>
             </w:r>
           </w:p>
         </w:tc>
       </w:tr>
     </w:tbl>
     <w:p>
-      <w:pPr>
-        <w:pStyle w:val="Caption"/>
-        <w:spacing w:after="140"/>
-      </w:pPr>
       <w:r>
-        <w:t>Figure 5. Live webcam preview showing Take Snapshot and Stop Webcam. Capture this before taking the snapshot.</w:t>
+        <w:t>Brightness and threshold sliders use steps of 1; contrast and RGB sliders use steps of 0.05. Grayscale, Histogram, Histogram Equalization, and Sharpening have no editable parameters.</w:t>
       </w:r>
     </w:p>
     <w:p>
       <w:pPr>
-        <w:pStyle w:val="Heading2"/>
+        <w:pStyle w:val="Heading1"/>
       </w:pPr>
       <w:r>
-        <w:t>Run locally</w:t>
+        <w:t>7. High-level design and conclusion</w:t>
       </w:r>
     </w:p>
     <w:p>
       <w:r>
-        <w:t>Use Python with Tkinter. Create/activate a virtual environment, install requirements.txt (OpenCV 4.x and NumPy 2.x), and run python main.py. Camera access requires operating-system permission. See README.md for platform setup and manual checks; context/code-documentation.md explains the code in detail.</w:t>
+        <w:t>The interface gathers user choices, the application coordinator checks the current state, and separate processing functions produce the result. File and webcam components manage input and output, while shared validation checks settings. Keeping these responsibilities separate makes the application easier to understand and maintain.</w:t>
+      </w:r>
+    </w:p>
+    <w:p>
+      <w:r>
+        <w:t>The project provides an interactive environment for comparing thirteen image-processing operations, exploring parameter effects, capturing webcam images, and saving results. Its combination of clear controls, preserved originals, and input validation supports practical learning and classroom demonstration.</w:t>
+      </w:r>
+    </w:p>
+    <w:p>
+      <w:r>
+        <w:t>Demo coverage: open an image, show at least four operations, adjust parameters live, access the webcam, take a snapshot, and save an output. Add the video link on page 1.</w:t>
       </w:r>
     </w:p>
     <w:sectPr>
@@ -2172,7 +2353,7 @@
     </w:pPr>
     <w:rPr>
       <w:rFonts w:ascii="Calibri" w:hAnsi="Calibri"/>
-      <w:sz w:val="20"/>
+      <w:sz w:val="21"/>
     </w:rPr>
   </w:style>
   <w:style w:type="paragraph" w:styleId="Header">
@@ -2230,15 +2411,15 @@
     <w:pPr>
       <w:keepNext/>
       <w:keepLines/>
-      <w:spacing w:before="180" w:after="80"/>
+      <w:spacing w:before="180" w:after="100"/>
       <w:outlineLvl w:val="0"/>
     </w:pPr>
     <w:rPr>
       <w:rFonts w:asciiTheme="majorHAnsi" w:eastAsiaTheme="majorEastAsia" w:hAnsiTheme="majorHAnsi" w:cstheme="majorBidi" w:ascii="Calibri" w:hAnsi="Calibri"/>
       <w:b/>
       <w:bCs/>
-      <w:color w:val="17365D"/>
-      <w:sz w:val="36"/>
+      <w:color w:val="234E70"/>
+      <w:sz w:val="34"/>
       <w:szCs w:val="28"/>
     </w:rPr>
   </w:style>
@@ -2254,15 +2435,15 @@
     <w:pPr>
       <w:keepNext/>
       <w:keepLines/>
-      <w:spacing w:before="180" w:after="80"/>
+      <w:spacing w:before="180" w:after="100"/>
       <w:outlineLvl w:val="1"/>
     </w:pPr>
     <w:rPr>
       <w:rFonts w:asciiTheme="majorHAnsi" w:eastAsiaTheme="majorEastAsia" w:hAnsiTheme="majorHAnsi" w:cstheme="majorBidi" w:ascii="Calibri" w:hAnsi="Calibri"/>
       <w:b/>
       <w:bCs/>
-      <w:color w:val="17365D"/>
-      <w:sz w:val="22"/>
+      <w:color w:val="234E70"/>
+      <w:sz w:val="23"/>
       <w:szCs w:val="26"/>
     </w:rPr>
   </w:style>
@@ -2519,12 +2700,12 @@
       <w:pBdr>
         <w:bottom w:val="single" w:sz="8" w:space="4" w:color="4F81BD" w:themeColor="accent1"/>
       </w:pBdr>
-      <w:spacing w:after="80" w:line="240" w:lineRule="auto" w:before="180"/>
+      <w:spacing w:after="100" w:line="240" w:lineRule="auto" w:before="180"/>
       <w:contextualSpacing/>
     </w:pPr>
     <w:rPr>
       <w:rFonts w:asciiTheme="majorHAnsi" w:eastAsiaTheme="majorEastAsia" w:hAnsiTheme="majorHAnsi" w:cstheme="majorBidi" w:ascii="Calibri" w:hAnsi="Calibri"/>
-      <w:color w:val="17365D"/>
+      <w:color w:val="234E70"/>
       <w:spacing w:val="5"/>
       <w:kern w:val="28"/>
       <w:sz w:val="50"/>

</xml_diff>